<commit_message>
Sertifikalı firma ve cihaz değişim ekranlarını güncelle
</commit_message>
<xml_diff>
--- a/YetkiliServisGazAcma.Core/Templates/Ykc/FR265_Yakici_Cihaz_Degisim_Formu.docx
+++ b/YetkiliServisGazAcma.Core/Templates/Ykc/FR265_Yakici_Cihaz_Degisim_Formu.docx
@@ -1,24 +1,26 @@
 
 <file path=word/document.xml><?xml version="1.0" encoding="utf-8"?>
-<w:document xmlns:wpc="http://schemas.microsoft.com/office/word/2010/wordprocessingCanvas" xmlns:cx="http://schemas.microsoft.com/office/drawing/2014/chartex" xmlns:cx1="http://schemas.microsoft.com/office/drawing/2015/9/8/chartex" xmlns:cx2="http://schemas.microsoft.com/office/drawing/2015/10/21/chartex" xmlns:cx3="http://schemas.microsoft.com/office/drawing/2016/5/9/chartex" xmlns:cx4="http://schemas.microsoft.com/office/drawing/2016/5/10/chartex" xmlns:cx5="http://schemas.microsoft.com/office/drawing/2016/5/11/chartex" xmlns:cx6="http://schemas.microsoft.com/office/drawing/2016/5/12/chartex" xmlns:cx7="http://schemas.microsoft.com/office/drawing/2016/5/13/chartex" xmlns:cx8="http://schemas.microsoft.com/office/drawing/2016/5/14/chartex" xmlns:mc="http://schemas.openxmlformats.org/markup-compatibility/2006" xmlns:aink="http://schemas.microsoft.com/office/drawing/2016/ink" xmlns:am3d="http://schemas.microsoft.com/office/drawing/2017/model3d" xmlns:o="urn:schemas-microsoft-com:office:office" xmlns:oel="http://schemas.microsoft.com/office/2019/extlst" xmlns:r="http://schemas.openxmlformats.org/officeDocument/2006/relationships" xmlns:m="http://schemas.openxmlformats.org/officeDocument/2006/math" xmlns:v="urn:schemas-microsoft-com:vml" xmlns:wp14="http://schemas.microsoft.com/office/word/2010/wordprocessingDrawing" xmlns:wp="http://schemas.openxmlformats.org/drawingml/2006/wordprocessingDrawing" xmlns:w10="urn:schemas-microsoft-com:office:word" xmlns:w="http://schemas.openxmlformats.org/wordprocessingml/2006/main" xmlns:w14="http://schemas.microsoft.com/office/word/2010/wordml" xmlns:w15="http://schemas.microsoft.com/office/word/2012/wordml" xmlns:w16cex="http://schemas.microsoft.com/office/word/2018/wordml/cex" xmlns:w16cid="http://schemas.microsoft.com/office/word/2016/wordml/cid" xmlns:w16="http://schemas.microsoft.com/office/word/2018/wordml" xmlns:w16sdtdh="http://schemas.microsoft.com/office/word/2020/wordml/sdtdatahash" xmlns:w16se="http://schemas.microsoft.com/office/word/2015/wordml/symex" xmlns:wpg="http://schemas.microsoft.com/office/word/2010/wordprocessingGroup" xmlns:wpi="http://schemas.microsoft.com/office/word/2010/wordprocessingInk" xmlns:wne="http://schemas.microsoft.com/office/word/2006/wordml" xmlns:wps="http://schemas.microsoft.com/office/word/2010/wordprocessingShape" mc:Ignorable="w14 w15 w16se w16cid w16 w16cex w16sdtdh wp14">
+<w:document xmlns:wpc="http://schemas.microsoft.com/office/word/2010/wordprocessingCanvas" xmlns:cx="http://schemas.microsoft.com/office/drawing/2014/chartex" xmlns:cx1="http://schemas.microsoft.com/office/drawing/2015/9/8/chartex" xmlns:cx2="http://schemas.microsoft.com/office/drawing/2015/10/21/chartex" xmlns:cx3="http://schemas.microsoft.com/office/drawing/2016/5/9/chartex" xmlns:cx4="http://schemas.microsoft.com/office/drawing/2016/5/10/chartex" xmlns:cx5="http://schemas.microsoft.com/office/drawing/2016/5/11/chartex" xmlns:cx6="http://schemas.microsoft.com/office/drawing/2016/5/12/chartex" xmlns:cx7="http://schemas.microsoft.com/office/drawing/2016/5/13/chartex" xmlns:cx8="http://schemas.microsoft.com/office/drawing/2016/5/14/chartex" xmlns:mc="http://schemas.openxmlformats.org/markup-compatibility/2006" xmlns:aink="http://schemas.microsoft.com/office/drawing/2016/ink" xmlns:am3d="http://schemas.microsoft.com/office/drawing/2017/model3d" xmlns:o="urn:schemas-microsoft-com:office:office" xmlns:oel="http://schemas.microsoft.com/office/2019/extlst" xmlns:r="http://schemas.openxmlformats.org/officeDocument/2006/relationships" xmlns:m="http://schemas.openxmlformats.org/officeDocument/2006/math" xmlns:v="urn:schemas-microsoft-com:vml" xmlns:wp14="http://schemas.microsoft.com/office/word/2010/wordprocessingDrawing" xmlns:wp="http://schemas.openxmlformats.org/drawingml/2006/wordprocessingDrawing" xmlns:w10="urn:schemas-microsoft-com:office:word" xmlns:w="http://schemas.openxmlformats.org/wordprocessingml/2006/main" xmlns:w14="http://schemas.microsoft.com/office/word/2010/wordml" xmlns:w15="http://schemas.microsoft.com/office/word/2012/wordml" xmlns:w16cei="http://schemas.microsoft.com/office/word/2026/wordml/cei" xmlns:w16cex="http://schemas.microsoft.com/office/word/2018/wordml/cex" xmlns:w16cid="http://schemas.microsoft.com/office/word/2016/wordml/cid" xmlns:w16="http://schemas.microsoft.com/office/word/2018/wordml" xmlns:w16du="http://schemas.microsoft.com/office/word/2023/wordml/word16du" xmlns:w16sdtdh="http://schemas.microsoft.com/office/word/2020/wordml/sdtdatahash" xmlns:w16sdtfl="http://schemas.microsoft.com/office/word/2024/wordml/sdtformatlock" xmlns:w16se="http://schemas.microsoft.com/office/word/2015/wordml/symex" xmlns:wpg="http://schemas.microsoft.com/office/word/2010/wordprocessingGroup" xmlns:wpi="http://schemas.microsoft.com/office/word/2010/wordprocessingInk" xmlns:wne="http://schemas.microsoft.com/office/word/2006/wordml" xmlns:wps="http://schemas.microsoft.com/office/word/2010/wordprocessingShape" mc:Ignorable="w14 w15 w16se w16cid w16 w16cex w16sdtdh w16sdtfl w16du wp14">
   <w:body>
     <w:p>
       <w:pPr>
         <w:rPr>
-          <w:rFonts w:ascii="Calibri" w:hAnsi="Calibri" w:cs="Arial"/>
+          <w:rFonts w:asciiTheme="minorHAnsi" w:hAnsiTheme="minorHAnsi" w:cstheme="minorHAnsi"/>
           <w:b/>
           <w:bCs/>
           <w:sz w:val="10"/>
           <w:szCs w:val="10"/>
         </w:rPr>
       </w:pPr>
+      <w:permStart w:id="189534822" w:edGrp="everyone"/>
+      <w:permEnd w:id="189534822"/>
     </w:p>
     <w:p>
       <w:pPr>
         <w:pStyle w:val="stBilgi"/>
         <w:jc w:val="right"/>
         <w:rPr>
-          <w:rFonts w:ascii="Calibri" w:hAnsi="Calibri" w:cs="Calibri"/>
+          <w:rFonts w:asciiTheme="minorHAnsi" w:hAnsiTheme="minorHAnsi" w:cstheme="minorHAnsi"/>
           <w:b/>
           <w:spacing w:val="90"/>
           <w:sz w:val="22"/>
@@ -27,7 +29,7 @@
       </w:pPr>
       <w:r>
         <w:rPr>
-          <w:rFonts w:ascii="Calibri" w:hAnsi="Calibri" w:cs="Calibri"/>
+          <w:rFonts w:asciiTheme="minorHAnsi" w:hAnsiTheme="minorHAnsi" w:cstheme="minorHAnsi"/>
           <w:b/>
           <w:sz w:val="22"/>
           <w:szCs w:val="22"/>
@@ -38,7 +40,7 @@
     <w:p>
       <w:pPr>
         <w:rPr>
-          <w:rFonts w:ascii="Calibri" w:hAnsi="Calibri" w:cs="Arial"/>
+          <w:rFonts w:asciiTheme="minorHAnsi" w:hAnsiTheme="minorHAnsi" w:cstheme="minorHAnsi"/>
           <w:b/>
           <w:bCs/>
           <w:sz w:val="10"/>
@@ -49,7 +51,7 @@
     <w:p>
       <w:pPr>
         <w:rPr>
-          <w:rFonts w:ascii="Calibri" w:hAnsi="Calibri" w:cs="Arial"/>
+          <w:rFonts w:asciiTheme="minorHAnsi" w:hAnsiTheme="minorHAnsi" w:cstheme="minorHAnsi"/>
           <w:b/>
           <w:bCs/>
           <w:sz w:val="10"/>
@@ -90,20 +92,19 @@
               <w:top w:val="single" w:sz="4" w:space="0" w:color="auto"/>
               <w:right w:val="single" w:sz="4" w:space="0" w:color="auto"/>
             </w:tcBorders>
-            <w:shd w:val="clear" w:color="auto" w:fill="auto"/>
             <w:vAlign w:val="center"/>
           </w:tcPr>
           <w:p>
             <w:pPr>
               <w:rPr>
-                <w:rFonts w:ascii="Calibri" w:hAnsi="Calibri"/>
-                <w:sz w:val="22"/>
-                <w:szCs w:val="20"/>
-              </w:rPr>
-            </w:pPr>
-            <w:r>
-              <w:rPr>
-                <w:rFonts w:ascii="Calibri" w:hAnsi="Calibri"/>
+                <w:rFonts w:asciiTheme="minorHAnsi" w:hAnsiTheme="minorHAnsi" w:cstheme="minorHAnsi"/>
+                <w:sz w:val="22"/>
+                <w:szCs w:val="20"/>
+              </w:rPr>
+            </w:pPr>
+            <w:r>
+              <w:rPr>
+                <w:rFonts w:asciiTheme="minorHAnsi" w:hAnsiTheme="minorHAnsi" w:cstheme="minorHAnsi"/>
                 <w:b/>
                 <w:szCs w:val="20"/>
               </w:rPr>
@@ -118,13 +119,12 @@
               <w:top w:val="single" w:sz="4" w:space="0" w:color="auto"/>
               <w:left w:val="single" w:sz="4" w:space="0" w:color="auto"/>
             </w:tcBorders>
-            <w:shd w:val="clear" w:color="auto" w:fill="auto"/>
             <w:vAlign w:val="center"/>
           </w:tcPr>
           <w:p>
             <w:pPr>
               <w:rPr>
-                <w:rFonts w:ascii="Calibri" w:hAnsi="Calibri"/>
+                <w:rFonts w:asciiTheme="minorHAnsi" w:hAnsiTheme="minorHAnsi" w:cstheme="minorHAnsi"/>
                 <w:b/>
                 <w:sz w:val="22"/>
                 <w:szCs w:val="20"/>
@@ -140,7 +140,7 @@
           <w:tab w:val="left" w:pos="1395"/>
         </w:tabs>
         <w:rPr>
-          <w:rFonts w:ascii="Calibri" w:hAnsi="Calibri" w:cs="Arial"/>
+          <w:rFonts w:asciiTheme="minorHAnsi" w:hAnsiTheme="minorHAnsi" w:cstheme="minorHAnsi"/>
           <w:b/>
           <w:bCs/>
           <w:sz w:val="12"/>
@@ -154,21 +154,7 @@
           <w:tab w:val="left" w:pos="1395"/>
         </w:tabs>
         <w:rPr>
-          <w:rFonts w:ascii="Calibri" w:hAnsi="Calibri" w:cs="Arial"/>
-          <w:b/>
-          <w:bCs/>
-          <w:sz w:val="12"/>
-          <w:szCs w:val="10"/>
-        </w:rPr>
-      </w:pPr>
-    </w:p>
-    <w:p>
-      <w:pPr>
-        <w:tabs>
-          <w:tab w:val="left" w:pos="1395"/>
-        </w:tabs>
-        <w:rPr>
-          <w:rFonts w:ascii="Calibri" w:hAnsi="Calibri" w:cs="Arial"/>
+          <w:rFonts w:asciiTheme="minorHAnsi" w:hAnsiTheme="minorHAnsi" w:cstheme="minorHAnsi"/>
           <w:b/>
           <w:bCs/>
           <w:sz w:val="12"/>
@@ -209,20 +195,19 @@
               <w:top w:val="single" w:sz="4" w:space="0" w:color="auto"/>
               <w:right w:val="single" w:sz="4" w:space="0" w:color="auto"/>
             </w:tcBorders>
-            <w:shd w:val="clear" w:color="auto" w:fill="auto"/>
             <w:vAlign w:val="center"/>
           </w:tcPr>
           <w:p>
             <w:pPr>
               <w:rPr>
-                <w:rFonts w:ascii="Calibri" w:hAnsi="Calibri"/>
-                <w:sz w:val="22"/>
-                <w:szCs w:val="20"/>
-              </w:rPr>
-            </w:pPr>
-            <w:r>
-              <w:rPr>
-                <w:rFonts w:ascii="Calibri" w:hAnsi="Calibri"/>
+                <w:rFonts w:asciiTheme="minorHAnsi" w:hAnsiTheme="minorHAnsi" w:cstheme="minorHAnsi"/>
+                <w:sz w:val="22"/>
+                <w:szCs w:val="20"/>
+              </w:rPr>
+            </w:pPr>
+            <w:r>
+              <w:rPr>
+                <w:rFonts w:asciiTheme="minorHAnsi" w:hAnsiTheme="minorHAnsi" w:cstheme="minorHAnsi"/>
                 <w:b/>
                 <w:szCs w:val="20"/>
               </w:rPr>
@@ -237,13 +222,12 @@
               <w:top w:val="single" w:sz="4" w:space="0" w:color="auto"/>
               <w:left w:val="single" w:sz="4" w:space="0" w:color="auto"/>
             </w:tcBorders>
-            <w:shd w:val="clear" w:color="auto" w:fill="auto"/>
             <w:vAlign w:val="center"/>
           </w:tcPr>
           <w:p>
             <w:pPr>
               <w:rPr>
-                <w:rFonts w:ascii="Calibri" w:hAnsi="Calibri"/>
+                <w:rFonts w:asciiTheme="minorHAnsi" w:hAnsiTheme="minorHAnsi" w:cstheme="minorHAnsi"/>
                 <w:b/>
                 <w:sz w:val="22"/>
                 <w:szCs w:val="20"/>
@@ -259,7 +243,7 @@
           <w:tab w:val="left" w:pos="1395"/>
         </w:tabs>
         <w:rPr>
-          <w:rFonts w:ascii="Calibri" w:hAnsi="Calibri" w:cs="Arial"/>
+          <w:rFonts w:asciiTheme="minorHAnsi" w:hAnsiTheme="minorHAnsi" w:cstheme="minorHAnsi"/>
           <w:b/>
           <w:bCs/>
           <w:sz w:val="12"/>
@@ -273,21 +257,7 @@
           <w:tab w:val="left" w:pos="1395"/>
         </w:tabs>
         <w:rPr>
-          <w:rFonts w:ascii="Calibri" w:hAnsi="Calibri" w:cs="Arial"/>
-          <w:b/>
-          <w:bCs/>
-          <w:sz w:val="12"/>
-          <w:szCs w:val="10"/>
-        </w:rPr>
-      </w:pPr>
-    </w:p>
-    <w:p>
-      <w:pPr>
-        <w:tabs>
-          <w:tab w:val="left" w:pos="1395"/>
-        </w:tabs>
-        <w:rPr>
-          <w:rFonts w:ascii="Calibri" w:hAnsi="Calibri" w:cs="Arial"/>
+          <w:rFonts w:asciiTheme="minorHAnsi" w:hAnsiTheme="minorHAnsi" w:cstheme="minorHAnsi"/>
           <w:b/>
           <w:bCs/>
           <w:sz w:val="12"/>
@@ -317,36 +287,35 @@
           <w:p>
             <w:pPr>
               <w:pStyle w:val="Balk1"/>
-              <w:outlineLvl w:val="0"/>
-              <w:rPr>
-                <w:rFonts w:ascii="Calibri" w:hAnsi="Calibri"/>
-                <w:szCs w:val="20"/>
-              </w:rPr>
-            </w:pPr>
-            <w:r>
-              <w:rPr>
-                <w:rFonts w:ascii="Calibri" w:hAnsi="Calibri"/>
+              <w:rPr>
+                <w:rFonts w:asciiTheme="minorHAnsi" w:hAnsiTheme="minorHAnsi" w:cstheme="minorHAnsi"/>
+                <w:szCs w:val="20"/>
+              </w:rPr>
+            </w:pPr>
+            <w:r>
+              <w:rPr>
+                <w:rFonts w:asciiTheme="minorHAnsi" w:hAnsiTheme="minorHAnsi" w:cstheme="minorHAnsi"/>
                 <w:szCs w:val="20"/>
               </w:rPr>
               <w:t>Ad</w:t>
             </w:r>
             <w:r>
               <w:rPr>
-                <w:rFonts w:ascii="Calibri" w:hAnsi="Calibri"/>
+                <w:rFonts w:asciiTheme="minorHAnsi" w:hAnsiTheme="minorHAnsi" w:cstheme="minorHAnsi"/>
                 <w:szCs w:val="20"/>
               </w:rPr>
               <w:t>ı</w:t>
             </w:r>
             <w:r>
               <w:rPr>
-                <w:rFonts w:ascii="Calibri" w:hAnsi="Calibri"/>
+                <w:rFonts w:asciiTheme="minorHAnsi" w:hAnsiTheme="minorHAnsi" w:cstheme="minorHAnsi"/>
                 <w:szCs w:val="20"/>
               </w:rPr>
               <w:t xml:space="preserve"> Soyad</w:t>
             </w:r>
             <w:r>
               <w:rPr>
-                <w:rFonts w:ascii="Calibri" w:hAnsi="Calibri"/>
+                <w:rFonts w:asciiTheme="minorHAnsi" w:hAnsiTheme="minorHAnsi" w:cstheme="minorHAnsi"/>
                 <w:szCs w:val="20"/>
               </w:rPr>
               <w:t>ı</w:t>
@@ -361,6 +330,7 @@
             <w:pPr>
               <w:pStyle w:val="AralkYok"/>
               <w:rPr>
+                <w:rFonts w:asciiTheme="minorHAnsi" w:hAnsiTheme="minorHAnsi" w:cstheme="minorHAnsi"/>
                 <w:sz w:val="22"/>
                 <w:szCs w:val="20"/>
               </w:rPr>
@@ -379,26 +349,18 @@
           <w:p>
             <w:pPr>
               <w:pStyle w:val="Balk1"/>
-              <w:outlineLvl w:val="0"/>
-              <w:rPr>
-                <w:rFonts w:ascii="Calibri" w:hAnsi="Calibri"/>
-                <w:szCs w:val="20"/>
-              </w:rPr>
-            </w:pPr>
-            <w:r>
-              <w:rPr>
-                <w:rFonts w:ascii="Calibri" w:hAnsi="Calibri"/>
+              <w:rPr>
+                <w:rFonts w:asciiTheme="minorHAnsi" w:hAnsiTheme="minorHAnsi" w:cstheme="minorHAnsi"/>
+                <w:szCs w:val="20"/>
+              </w:rPr>
+            </w:pPr>
+            <w:r>
+              <w:rPr>
+                <w:rFonts w:asciiTheme="minorHAnsi" w:hAnsiTheme="minorHAnsi" w:cstheme="minorHAnsi"/>
                 <w:szCs w:val="20"/>
               </w:rPr>
               <w:t>Tesisat Numarası</w:t>
             </w:r>
-            <w:r>
-              <w:rPr>
-                <w:rFonts w:ascii="Calibri" w:hAnsi="Calibri"/>
-                <w:szCs w:val="20"/>
-              </w:rPr>
-              <w:t xml:space="preserve"> (Kapı Numarası)</w:t>
-            </w:r>
           </w:p>
         </w:tc>
         <w:tc>
@@ -409,6 +371,7 @@
             <w:pPr>
               <w:pStyle w:val="AralkYok"/>
               <w:rPr>
+                <w:rFonts w:asciiTheme="minorHAnsi" w:hAnsiTheme="minorHAnsi" w:cstheme="minorHAnsi"/>
                 <w:sz w:val="22"/>
                 <w:szCs w:val="20"/>
               </w:rPr>
@@ -427,22 +390,21 @@
           <w:p>
             <w:pPr>
               <w:pStyle w:val="Balk1"/>
-              <w:outlineLvl w:val="0"/>
-              <w:rPr>
-                <w:rFonts w:ascii="Calibri" w:hAnsi="Calibri"/>
-                <w:szCs w:val="20"/>
-              </w:rPr>
-            </w:pPr>
-            <w:r>
-              <w:rPr>
-                <w:rFonts w:ascii="Calibri" w:hAnsi="Calibri"/>
+              <w:rPr>
+                <w:rFonts w:asciiTheme="minorHAnsi" w:hAnsiTheme="minorHAnsi" w:cstheme="minorHAnsi"/>
+                <w:szCs w:val="20"/>
+              </w:rPr>
+            </w:pPr>
+            <w:r>
+              <w:rPr>
+                <w:rFonts w:asciiTheme="minorHAnsi" w:hAnsiTheme="minorHAnsi" w:cstheme="minorHAnsi"/>
                 <w:szCs w:val="20"/>
               </w:rPr>
               <w:t>Tüketim Noktası</w:t>
             </w:r>
             <w:r>
               <w:rPr>
-                <w:rFonts w:ascii="Calibri" w:hAnsi="Calibri"/>
+                <w:rFonts w:asciiTheme="minorHAnsi" w:hAnsiTheme="minorHAnsi" w:cstheme="minorHAnsi"/>
                 <w:szCs w:val="20"/>
               </w:rPr>
               <w:t xml:space="preserve"> (Daire/İş Yeri Numarası)</w:t>
@@ -457,6 +419,7 @@
             <w:pPr>
               <w:pStyle w:val="AralkYok"/>
               <w:rPr>
+                <w:rFonts w:asciiTheme="minorHAnsi" w:hAnsiTheme="minorHAnsi" w:cstheme="minorHAnsi"/>
                 <w:sz w:val="22"/>
                 <w:szCs w:val="20"/>
               </w:rPr>
@@ -475,25 +438,24 @@
           <w:p>
             <w:pPr>
               <w:pStyle w:val="Balk1"/>
-              <w:outlineLvl w:val="0"/>
-              <w:rPr>
-                <w:rFonts w:ascii="Calibri" w:hAnsi="Calibri"/>
-                <w:szCs w:val="20"/>
-              </w:rPr>
-            </w:pPr>
-            <w:r>
-              <w:rPr>
-                <w:rFonts w:ascii="Calibri" w:hAnsi="Calibri"/>
-                <w:szCs w:val="20"/>
-              </w:rPr>
-              <w:t>Bağlantı Nesnesi</w:t>
-            </w:r>
-            <w:r>
-              <w:rPr>
-                <w:rFonts w:ascii="Calibri" w:hAnsi="Calibri"/>
-                <w:szCs w:val="20"/>
-              </w:rPr>
-              <w:t xml:space="preserve"> (Bina Numarası)</w:t>
+              <w:rPr>
+                <w:rFonts w:asciiTheme="minorHAnsi" w:hAnsiTheme="minorHAnsi" w:cstheme="minorHAnsi"/>
+                <w:szCs w:val="20"/>
+              </w:rPr>
+            </w:pPr>
+            <w:r>
+              <w:rPr>
+                <w:rFonts w:asciiTheme="minorHAnsi" w:hAnsiTheme="minorHAnsi" w:cstheme="minorHAnsi"/>
+                <w:szCs w:val="20"/>
+              </w:rPr>
+              <w:t xml:space="preserve">Bina </w:t>
+            </w:r>
+            <w:r>
+              <w:rPr>
+                <w:rFonts w:asciiTheme="minorHAnsi" w:hAnsiTheme="minorHAnsi" w:cstheme="minorHAnsi"/>
+                <w:szCs w:val="20"/>
+              </w:rPr>
+              <w:t>Kodu</w:t>
             </w:r>
           </w:p>
         </w:tc>
@@ -505,6 +467,7 @@
             <w:pPr>
               <w:pStyle w:val="AralkYok"/>
               <w:rPr>
+                <w:rFonts w:asciiTheme="minorHAnsi" w:hAnsiTheme="minorHAnsi" w:cstheme="minorHAnsi"/>
                 <w:sz w:val="22"/>
                 <w:szCs w:val="20"/>
               </w:rPr>
@@ -523,15 +486,14 @@
           <w:p>
             <w:pPr>
               <w:pStyle w:val="Balk1"/>
-              <w:outlineLvl w:val="0"/>
-              <w:rPr>
-                <w:rFonts w:ascii="Calibri" w:hAnsi="Calibri"/>
-                <w:szCs w:val="20"/>
-              </w:rPr>
-            </w:pPr>
-            <w:r>
-              <w:rPr>
-                <w:rFonts w:ascii="Calibri" w:hAnsi="Calibri"/>
+              <w:rPr>
+                <w:rFonts w:asciiTheme="minorHAnsi" w:hAnsiTheme="minorHAnsi" w:cstheme="minorHAnsi"/>
+                <w:szCs w:val="20"/>
+              </w:rPr>
+            </w:pPr>
+            <w:r>
+              <w:rPr>
+                <w:rFonts w:asciiTheme="minorHAnsi" w:hAnsiTheme="minorHAnsi" w:cstheme="minorHAnsi"/>
                 <w:szCs w:val="20"/>
               </w:rPr>
               <w:t>Adres</w:t>
@@ -541,6 +503,7 @@
             <w:pPr>
               <w:jc w:val="center"/>
               <w:rPr>
+                <w:rFonts w:asciiTheme="minorHAnsi" w:hAnsiTheme="minorHAnsi" w:cstheme="minorHAnsi"/>
                 <w:sz w:val="28"/>
               </w:rPr>
             </w:pPr>
@@ -554,6 +517,7 @@
             <w:pPr>
               <w:pStyle w:val="AralkYok"/>
               <w:rPr>
+                <w:rFonts w:asciiTheme="minorHAnsi" w:hAnsiTheme="minorHAnsi" w:cstheme="minorHAnsi"/>
                 <w:sz w:val="22"/>
                 <w:szCs w:val="20"/>
               </w:rPr>
@@ -568,35 +532,7 @@
           <w:tab w:val="left" w:pos="1395"/>
         </w:tabs>
         <w:rPr>
-          <w:rFonts w:ascii="Calibri" w:hAnsi="Calibri" w:cs="Arial"/>
-          <w:b/>
-          <w:bCs/>
-          <w:sz w:val="12"/>
-          <w:szCs w:val="10"/>
-        </w:rPr>
-      </w:pPr>
-    </w:p>
-    <w:p>
-      <w:pPr>
-        <w:tabs>
-          <w:tab w:val="left" w:pos="1395"/>
-        </w:tabs>
-        <w:rPr>
-          <w:rFonts w:ascii="Calibri" w:hAnsi="Calibri" w:cs="Arial"/>
-          <w:b/>
-          <w:bCs/>
-          <w:sz w:val="12"/>
-          <w:szCs w:val="10"/>
-        </w:rPr>
-      </w:pPr>
-    </w:p>
-    <w:p>
-      <w:pPr>
-        <w:tabs>
-          <w:tab w:val="left" w:pos="1395"/>
-        </w:tabs>
-        <w:rPr>
-          <w:rFonts w:ascii="Calibri" w:hAnsi="Calibri" w:cs="Arial"/>
+          <w:rFonts w:asciiTheme="minorHAnsi" w:hAnsiTheme="minorHAnsi" w:cstheme="minorHAnsi"/>
           <w:b/>
           <w:bCs/>
           <w:sz w:val="12"/>
@@ -628,6 +564,7 @@
             <w:pPr>
               <w:pStyle w:val="AralkYok"/>
               <w:rPr>
+                <w:rFonts w:asciiTheme="minorHAnsi" w:hAnsiTheme="minorHAnsi" w:cstheme="minorHAnsi"/>
                 <w:sz w:val="22"/>
                 <w:szCs w:val="20"/>
               </w:rPr>
@@ -642,29 +579,29 @@
             <w:pPr>
               <w:pStyle w:val="Balk1"/>
               <w:jc w:val="center"/>
-              <w:outlineLvl w:val="0"/>
-              <w:rPr>
+              <w:rPr>
+                <w:rFonts w:asciiTheme="minorHAnsi" w:hAnsiTheme="minorHAnsi" w:cstheme="minorHAnsi"/>
                 <w:b w:val="0"/>
                 <w:szCs w:val="20"/>
               </w:rPr>
             </w:pPr>
             <w:r>
               <w:rPr>
-                <w:rFonts w:ascii="Calibri" w:hAnsi="Calibri"/>
+                <w:rFonts w:asciiTheme="minorHAnsi" w:hAnsiTheme="minorHAnsi" w:cstheme="minorHAnsi"/>
                 <w:szCs w:val="20"/>
               </w:rPr>
               <w:t>Projedeki</w:t>
             </w:r>
             <w:r>
               <w:rPr>
-                <w:rFonts w:ascii="Calibri" w:hAnsi="Calibri"/>
+                <w:rFonts w:asciiTheme="minorHAnsi" w:hAnsiTheme="minorHAnsi" w:cstheme="minorHAnsi"/>
                 <w:szCs w:val="20"/>
               </w:rPr>
               <w:t xml:space="preserve"> </w:t>
             </w:r>
             <w:r>
               <w:rPr>
-                <w:rFonts w:ascii="Calibri" w:hAnsi="Calibri"/>
+                <w:rFonts w:asciiTheme="minorHAnsi" w:hAnsiTheme="minorHAnsi" w:cstheme="minorHAnsi"/>
                 <w:szCs w:val="20"/>
               </w:rPr>
               <w:t>Cihaz</w:t>
@@ -679,35 +616,35 @@
             <w:pPr>
               <w:pStyle w:val="Balk1"/>
               <w:jc w:val="center"/>
-              <w:outlineLvl w:val="0"/>
-              <w:rPr>
-                <w:szCs w:val="20"/>
-              </w:rPr>
-            </w:pPr>
-            <w:r>
-              <w:rPr>
-                <w:rFonts w:ascii="Calibri" w:hAnsi="Calibri"/>
+              <w:rPr>
+                <w:rFonts w:asciiTheme="minorHAnsi" w:hAnsiTheme="minorHAnsi" w:cstheme="minorHAnsi"/>
+                <w:szCs w:val="20"/>
+              </w:rPr>
+            </w:pPr>
+            <w:r>
+              <w:rPr>
+                <w:rFonts w:asciiTheme="minorHAnsi" w:hAnsiTheme="minorHAnsi" w:cstheme="minorHAnsi"/>
                 <w:szCs w:val="20"/>
               </w:rPr>
               <w:t xml:space="preserve">Yeni </w:t>
             </w:r>
             <w:r>
               <w:rPr>
-                <w:rFonts w:ascii="Calibri" w:hAnsi="Calibri"/>
+                <w:rFonts w:asciiTheme="minorHAnsi" w:hAnsiTheme="minorHAnsi" w:cstheme="minorHAnsi"/>
                 <w:szCs w:val="20"/>
               </w:rPr>
               <w:t>Kullanıla</w:t>
             </w:r>
             <w:r>
               <w:rPr>
-                <w:rFonts w:ascii="Calibri" w:hAnsi="Calibri"/>
+                <w:rFonts w:asciiTheme="minorHAnsi" w:hAnsiTheme="minorHAnsi" w:cstheme="minorHAnsi"/>
                 <w:szCs w:val="20"/>
               </w:rPr>
               <w:t>n</w:t>
             </w:r>
             <w:r>
               <w:rPr>
-                <w:rFonts w:ascii="Calibri" w:hAnsi="Calibri"/>
+                <w:rFonts w:asciiTheme="minorHAnsi" w:hAnsiTheme="minorHAnsi" w:cstheme="minorHAnsi"/>
                 <w:szCs w:val="20"/>
               </w:rPr>
               <w:t xml:space="preserve"> Cihaz</w:t>
@@ -726,15 +663,14 @@
           <w:p>
             <w:pPr>
               <w:pStyle w:val="Balk1"/>
-              <w:outlineLvl w:val="0"/>
-              <w:rPr>
-                <w:rFonts w:ascii="Calibri" w:hAnsi="Calibri"/>
-                <w:szCs w:val="20"/>
-              </w:rPr>
-            </w:pPr>
-            <w:r>
-              <w:rPr>
-                <w:rFonts w:ascii="Calibri" w:hAnsi="Calibri"/>
+              <w:rPr>
+                <w:rFonts w:asciiTheme="minorHAnsi" w:hAnsiTheme="minorHAnsi" w:cstheme="minorHAnsi"/>
+                <w:szCs w:val="20"/>
+              </w:rPr>
+            </w:pPr>
+            <w:r>
+              <w:rPr>
+                <w:rFonts w:asciiTheme="minorHAnsi" w:hAnsiTheme="minorHAnsi" w:cstheme="minorHAnsi"/>
                 <w:szCs w:val="20"/>
               </w:rPr>
               <w:t>Yakıcı Cihaz Tipi</w:t>
@@ -749,6 +685,7 @@
             <w:pPr>
               <w:pStyle w:val="AralkYok"/>
               <w:rPr>
+                <w:rFonts w:asciiTheme="minorHAnsi" w:hAnsiTheme="minorHAnsi" w:cstheme="minorHAnsi"/>
                 <w:sz w:val="22"/>
                 <w:szCs w:val="20"/>
               </w:rPr>
@@ -763,6 +700,7 @@
             <w:pPr>
               <w:pStyle w:val="AralkYok"/>
               <w:rPr>
+                <w:rFonts w:asciiTheme="minorHAnsi" w:hAnsiTheme="minorHAnsi" w:cstheme="minorHAnsi"/>
                 <w:sz w:val="22"/>
                 <w:szCs w:val="20"/>
               </w:rPr>
@@ -781,15 +719,14 @@
           <w:p>
             <w:pPr>
               <w:pStyle w:val="Balk1"/>
-              <w:outlineLvl w:val="0"/>
-              <w:rPr>
-                <w:rFonts w:ascii="Calibri" w:hAnsi="Calibri"/>
-                <w:szCs w:val="20"/>
-              </w:rPr>
-            </w:pPr>
-            <w:r>
-              <w:rPr>
-                <w:rFonts w:ascii="Calibri" w:hAnsi="Calibri"/>
+              <w:rPr>
+                <w:rFonts w:asciiTheme="minorHAnsi" w:hAnsiTheme="minorHAnsi" w:cstheme="minorHAnsi"/>
+                <w:szCs w:val="20"/>
+              </w:rPr>
+            </w:pPr>
+            <w:r>
+              <w:rPr>
+                <w:rFonts w:asciiTheme="minorHAnsi" w:hAnsiTheme="minorHAnsi" w:cstheme="minorHAnsi"/>
                 <w:szCs w:val="20"/>
               </w:rPr>
               <w:t>Marka</w:t>
@@ -804,6 +741,7 @@
             <w:pPr>
               <w:pStyle w:val="AralkYok"/>
               <w:rPr>
+                <w:rFonts w:asciiTheme="minorHAnsi" w:hAnsiTheme="minorHAnsi" w:cstheme="minorHAnsi"/>
                 <w:sz w:val="22"/>
                 <w:szCs w:val="20"/>
               </w:rPr>
@@ -818,6 +756,7 @@
             <w:pPr>
               <w:pStyle w:val="AralkYok"/>
               <w:rPr>
+                <w:rFonts w:asciiTheme="minorHAnsi" w:hAnsiTheme="minorHAnsi" w:cstheme="minorHAnsi"/>
                 <w:sz w:val="22"/>
                 <w:szCs w:val="20"/>
               </w:rPr>
@@ -836,15 +775,14 @@
           <w:p>
             <w:pPr>
               <w:pStyle w:val="Balk1"/>
-              <w:outlineLvl w:val="0"/>
-              <w:rPr>
-                <w:rFonts w:ascii="Calibri" w:hAnsi="Calibri"/>
-                <w:szCs w:val="20"/>
-              </w:rPr>
-            </w:pPr>
-            <w:r>
-              <w:rPr>
-                <w:rFonts w:ascii="Calibri" w:hAnsi="Calibri"/>
+              <w:rPr>
+                <w:rFonts w:asciiTheme="minorHAnsi" w:hAnsiTheme="minorHAnsi" w:cstheme="minorHAnsi"/>
+                <w:szCs w:val="20"/>
+              </w:rPr>
+            </w:pPr>
+            <w:r>
+              <w:rPr>
+                <w:rFonts w:asciiTheme="minorHAnsi" w:hAnsiTheme="minorHAnsi" w:cstheme="minorHAnsi"/>
                 <w:szCs w:val="20"/>
               </w:rPr>
               <w:t>Baca Tipi</w:t>
@@ -859,6 +797,7 @@
             <w:pPr>
               <w:pStyle w:val="AralkYok"/>
               <w:rPr>
+                <w:rFonts w:asciiTheme="minorHAnsi" w:hAnsiTheme="minorHAnsi" w:cstheme="minorHAnsi"/>
                 <w:sz w:val="22"/>
                 <w:szCs w:val="20"/>
               </w:rPr>
@@ -873,6 +812,7 @@
             <w:pPr>
               <w:pStyle w:val="AralkYok"/>
               <w:rPr>
+                <w:rFonts w:asciiTheme="minorHAnsi" w:hAnsiTheme="minorHAnsi" w:cstheme="minorHAnsi"/>
                 <w:sz w:val="22"/>
                 <w:szCs w:val="20"/>
               </w:rPr>
@@ -891,29 +831,28 @@
           <w:p>
             <w:pPr>
               <w:pStyle w:val="Balk1"/>
-              <w:outlineLvl w:val="0"/>
-              <w:rPr>
-                <w:rFonts w:ascii="Calibri" w:hAnsi="Calibri"/>
-                <w:szCs w:val="20"/>
-              </w:rPr>
-            </w:pPr>
-            <w:r>
-              <w:rPr>
-                <w:rFonts w:ascii="Calibri" w:hAnsi="Calibri"/>
+              <w:rPr>
+                <w:rFonts w:asciiTheme="minorHAnsi" w:hAnsiTheme="minorHAnsi" w:cstheme="minorHAnsi"/>
+                <w:szCs w:val="20"/>
+              </w:rPr>
+            </w:pPr>
+            <w:r>
+              <w:rPr>
+                <w:rFonts w:asciiTheme="minorHAnsi" w:hAnsiTheme="minorHAnsi" w:cstheme="minorHAnsi"/>
                 <w:szCs w:val="20"/>
               </w:rPr>
               <w:t>Kapasite (</w:t>
             </w:r>
             <w:r>
               <w:rPr>
-                <w:rFonts w:ascii="Calibri" w:hAnsi="Calibri"/>
+                <w:rFonts w:asciiTheme="minorHAnsi" w:hAnsiTheme="minorHAnsi" w:cstheme="minorHAnsi"/>
                 <w:szCs w:val="20"/>
               </w:rPr>
               <w:t>kcal/h</w:t>
             </w:r>
             <w:r>
               <w:rPr>
-                <w:rFonts w:ascii="Calibri" w:hAnsi="Calibri"/>
+                <w:rFonts w:asciiTheme="minorHAnsi" w:hAnsiTheme="minorHAnsi" w:cstheme="minorHAnsi"/>
                 <w:szCs w:val="20"/>
               </w:rPr>
               <w:t>)</w:t>
@@ -928,6 +867,7 @@
             <w:pPr>
               <w:pStyle w:val="AralkYok"/>
               <w:rPr>
+                <w:rFonts w:asciiTheme="minorHAnsi" w:hAnsiTheme="minorHAnsi" w:cstheme="minorHAnsi"/>
                 <w:sz w:val="22"/>
                 <w:szCs w:val="20"/>
               </w:rPr>
@@ -942,6 +882,7 @@
             <w:pPr>
               <w:pStyle w:val="AralkYok"/>
               <w:rPr>
+                <w:rFonts w:asciiTheme="minorHAnsi" w:hAnsiTheme="minorHAnsi" w:cstheme="minorHAnsi"/>
                 <w:sz w:val="22"/>
                 <w:szCs w:val="20"/>
               </w:rPr>
@@ -953,6 +894,199 @@
     <w:p>
       <w:pPr>
         <w:rPr>
+          <w:rFonts w:asciiTheme="minorHAnsi" w:hAnsiTheme="minorHAnsi" w:cstheme="minorHAnsi"/>
+          <w:sz w:val="12"/>
+          <w:szCs w:val="10"/>
+        </w:rPr>
+      </w:pPr>
+    </w:p>
+    <w:tbl>
+      <w:tblPr>
+        <w:tblStyle w:val="TabloKlavuzu"/>
+        <w:tblW w:w="11057" w:type="dxa"/>
+        <w:tblInd w:w="-147" w:type="dxa"/>
+        <w:tblLook w:val="04A0" w:firstRow="1" w:lastRow="0" w:firstColumn="1" w:lastColumn="0" w:noHBand="0" w:noVBand="1"/>
+      </w:tblPr>
+      <w:tblGrid>
+        <w:gridCol w:w="3970"/>
+        <w:gridCol w:w="3543"/>
+        <w:gridCol w:w="3544"/>
+      </w:tblGrid>
+      <w:tr>
+        <w:trPr>
+          <w:trHeight w:val="289"/>
+        </w:trPr>
+        <w:tc>
+          <w:tcPr>
+            <w:tcW w:w="3970" w:type="dxa"/>
+            <w:vMerge w:val="restart"/>
+          </w:tcPr>
+          <w:p>
+            <w:pPr>
+              <w:pStyle w:val="Balk1"/>
+              <w:jc w:val="center"/>
+              <w:rPr>
+                <w:rFonts w:asciiTheme="minorHAnsi" w:hAnsiTheme="minorHAnsi" w:cstheme="minorHAnsi"/>
+                <w:szCs w:val="20"/>
+              </w:rPr>
+            </w:pPr>
+          </w:p>
+          <w:p>
+            <w:pPr>
+              <w:pStyle w:val="Balk1"/>
+              <w:jc w:val="center"/>
+              <w:rPr>
+                <w:rFonts w:asciiTheme="minorHAnsi" w:hAnsiTheme="minorHAnsi" w:cstheme="minorHAnsi"/>
+                <w:szCs w:val="20"/>
+              </w:rPr>
+            </w:pPr>
+            <w:r>
+              <w:rPr>
+                <w:rFonts w:asciiTheme="minorHAnsi" w:hAnsiTheme="minorHAnsi" w:cstheme="minorHAnsi"/>
+                <w:szCs w:val="20"/>
+              </w:rPr>
+              <w:t>Takılan Yakıcı Cihaz İkinci El Cihaz Mı?</w:t>
+            </w:r>
+          </w:p>
+        </w:tc>
+        <w:tc>
+          <w:tcPr>
+            <w:tcW w:w="3543" w:type="dxa"/>
+          </w:tcPr>
+          <w:p>
+            <w:pPr>
+              <w:pStyle w:val="Balk1"/>
+              <w:jc w:val="center"/>
+              <w:rPr>
+                <w:rFonts w:asciiTheme="minorHAnsi" w:hAnsiTheme="minorHAnsi" w:cstheme="minorHAnsi"/>
+                <w:szCs w:val="20"/>
+              </w:rPr>
+            </w:pPr>
+            <w:r>
+              <w:rPr>
+                <w:rFonts w:asciiTheme="minorHAnsi" w:hAnsiTheme="minorHAnsi" w:cstheme="minorHAnsi"/>
+                <w:szCs w:val="20"/>
+              </w:rPr>
+              <w:t>Evet</w:t>
+            </w:r>
+          </w:p>
+        </w:tc>
+        <w:tc>
+          <w:tcPr>
+            <w:tcW w:w="3544" w:type="dxa"/>
+          </w:tcPr>
+          <w:p>
+            <w:pPr>
+              <w:pStyle w:val="Balk1"/>
+              <w:jc w:val="center"/>
+              <w:rPr>
+                <w:rFonts w:asciiTheme="minorHAnsi" w:hAnsiTheme="minorHAnsi" w:cstheme="minorHAnsi"/>
+                <w:szCs w:val="20"/>
+              </w:rPr>
+            </w:pPr>
+            <w:r>
+              <w:rPr>
+                <w:rFonts w:asciiTheme="minorHAnsi" w:hAnsiTheme="minorHAnsi" w:cstheme="minorHAnsi"/>
+                <w:szCs w:val="20"/>
+              </w:rPr>
+              <w:t>Hayır</w:t>
+            </w:r>
+          </w:p>
+        </w:tc>
+      </w:tr>
+      <w:tr>
+        <w:trPr>
+          <w:trHeight w:val="375"/>
+        </w:trPr>
+        <w:tc>
+          <w:tcPr>
+            <w:tcW w:w="3970" w:type="dxa"/>
+            <w:vMerge/>
+            <w:tcBorders>
+              <w:bottom w:val="single" w:sz="4" w:space="0" w:color="auto"/>
+            </w:tcBorders>
+          </w:tcPr>
+          <w:p>
+            <w:pPr>
+              <w:pStyle w:val="Balk1"/>
+              <w:rPr>
+                <w:rFonts w:asciiTheme="minorHAnsi" w:hAnsiTheme="minorHAnsi" w:cstheme="minorHAnsi"/>
+                <w:szCs w:val="20"/>
+              </w:rPr>
+            </w:pPr>
+          </w:p>
+        </w:tc>
+        <w:tc>
+          <w:tcPr>
+            <w:tcW w:w="3543" w:type="dxa"/>
+            <w:tcBorders>
+              <w:bottom w:val="single" w:sz="4" w:space="0" w:color="auto"/>
+            </w:tcBorders>
+          </w:tcPr>
+          <w:p>
+            <w:pPr>
+              <w:pStyle w:val="Balk1"/>
+              <w:jc w:val="center"/>
+              <w:rPr>
+                <w:rFonts w:asciiTheme="minorHAnsi" w:hAnsiTheme="minorHAnsi" w:cstheme="minorHAnsi"/>
+                <w:szCs w:val="20"/>
+              </w:rPr>
+            </w:pPr>
+          </w:p>
+        </w:tc>
+        <w:tc>
+          <w:tcPr>
+            <w:tcW w:w="3544" w:type="dxa"/>
+            <w:tcBorders>
+              <w:bottom w:val="single" w:sz="4" w:space="0" w:color="auto"/>
+            </w:tcBorders>
+          </w:tcPr>
+          <w:p>
+            <w:pPr>
+              <w:pStyle w:val="Balk1"/>
+              <w:jc w:val="center"/>
+              <w:rPr>
+                <w:rFonts w:asciiTheme="minorHAnsi" w:hAnsiTheme="minorHAnsi" w:cstheme="minorHAnsi"/>
+                <w:szCs w:val="20"/>
+              </w:rPr>
+            </w:pPr>
+          </w:p>
+        </w:tc>
+      </w:tr>
+      <w:tr>
+        <w:trPr>
+          <w:trHeight w:val="315"/>
+        </w:trPr>
+        <w:tc>
+          <w:tcPr>
+            <w:tcW w:w="11057" w:type="dxa"/>
+            <w:gridSpan w:val="3"/>
+          </w:tcPr>
+          <w:p>
+            <w:pPr>
+              <w:pStyle w:val="Balk1"/>
+              <w:jc w:val="center"/>
+              <w:rPr>
+                <w:rFonts w:asciiTheme="minorHAnsi" w:hAnsiTheme="minorHAnsi" w:cstheme="minorHAnsi"/>
+                <w:sz w:val="56"/>
+                <w:szCs w:val="20"/>
+              </w:rPr>
+            </w:pPr>
+            <w:r>
+              <w:rPr>
+                <w:rFonts w:asciiTheme="minorHAnsi" w:hAnsiTheme="minorHAnsi" w:cstheme="minorHAnsi"/>
+                <w:szCs w:val="20"/>
+              </w:rPr>
+              <w:t xml:space="preserve">Cihazın ikinci el olması durumunda, bu evrakla birlikte yetkili servis tarafından düzenlenecek “Yetkili Servis Cihaz Kontrol Raporu”  bu forma eklenmelidir. </w:t>
+            </w:r>
+          </w:p>
+        </w:tc>
+      </w:tr>
+    </w:tbl>
+    <w:p>
+      <w:pPr>
+        <w:rPr>
+          <w:rFonts w:asciiTheme="minorHAnsi" w:hAnsiTheme="minorHAnsi" w:cstheme="minorHAnsi"/>
           <w:sz w:val="12"/>
           <w:szCs w:val="10"/>
         </w:rPr>
@@ -961,30 +1095,7 @@
     <w:p>
       <w:pPr>
         <w:rPr>
-          <w:sz w:val="12"/>
-          <w:szCs w:val="10"/>
-        </w:rPr>
-      </w:pPr>
-    </w:p>
-    <w:p>
-      <w:pPr>
-        <w:rPr>
-          <w:sz w:val="12"/>
-          <w:szCs w:val="10"/>
-        </w:rPr>
-      </w:pPr>
-    </w:p>
-    <w:p>
-      <w:pPr>
-        <w:rPr>
-          <w:sz w:val="12"/>
-          <w:szCs w:val="10"/>
-        </w:rPr>
-      </w:pPr>
-    </w:p>
-    <w:p>
-      <w:pPr>
-        <w:rPr>
+          <w:rFonts w:asciiTheme="minorHAnsi" w:hAnsiTheme="minorHAnsi" w:cstheme="minorHAnsi"/>
           <w:sz w:val="12"/>
           <w:szCs w:val="10"/>
         </w:rPr>
@@ -1014,13 +1125,12 @@
         <w:tc>
           <w:tcPr>
             <w:tcW w:w="10910" w:type="dxa"/>
-            <w:shd w:val="clear" w:color="auto" w:fill="auto"/>
           </w:tcPr>
           <w:p>
             <w:pPr>
               <w:pStyle w:val="GvdeMetni2"/>
               <w:rPr>
-                <w:rFonts w:ascii="Calibri" w:hAnsi="Calibri" w:cs="Arial"/>
+                <w:rFonts w:asciiTheme="minorHAnsi" w:hAnsiTheme="minorHAnsi" w:cstheme="minorHAnsi"/>
                 <w:sz w:val="22"/>
                 <w:szCs w:val="18"/>
               </w:rPr>
@@ -1030,15 +1140,15 @@
             <w:pPr>
               <w:pStyle w:val="GvdeMetni2"/>
               <w:rPr>
-                <w:rFonts w:ascii="Calibri" w:hAnsi="Calibri" w:cs="Arial"/>
-                <w:b/>
-                <w:sz w:val="22"/>
-                <w:szCs w:val="18"/>
-              </w:rPr>
-            </w:pPr>
-            <w:r>
-              <w:rPr>
-                <w:rFonts w:ascii="Calibri" w:hAnsi="Calibri" w:cs="Arial"/>
+                <w:rFonts w:asciiTheme="minorHAnsi" w:hAnsiTheme="minorHAnsi" w:cstheme="minorHAnsi"/>
+                <w:b/>
+                <w:sz w:val="22"/>
+                <w:szCs w:val="18"/>
+              </w:rPr>
+            </w:pPr>
+            <w:r>
+              <w:rPr>
+                <w:rFonts w:asciiTheme="minorHAnsi" w:hAnsiTheme="minorHAnsi" w:cstheme="minorHAnsi"/>
                 <w:b/>
                 <w:sz w:val="22"/>
                 <w:szCs w:val="18"/>
@@ -1047,7 +1157,7 @@
             </w:r>
             <w:r>
               <w:rPr>
-                <w:rFonts w:ascii="Calibri" w:hAnsi="Calibri" w:cs="Arial"/>
+                <w:rFonts w:asciiTheme="minorHAnsi" w:hAnsiTheme="minorHAnsi" w:cstheme="minorHAnsi"/>
                 <w:b/>
                 <w:sz w:val="22"/>
                 <w:szCs w:val="18"/>
@@ -1056,7 +1166,7 @@
             </w:r>
             <w:r>
               <w:rPr>
-                <w:rFonts w:ascii="Calibri" w:hAnsi="Calibri" w:cs="Arial"/>
+                <w:rFonts w:asciiTheme="minorHAnsi" w:hAnsiTheme="minorHAnsi" w:cstheme="minorHAnsi"/>
                 <w:b/>
                 <w:sz w:val="22"/>
                 <w:szCs w:val="18"/>
@@ -1065,7 +1175,7 @@
             </w:r>
             <w:r>
               <w:rPr>
-                <w:rFonts w:ascii="Calibri" w:hAnsi="Calibri" w:cs="Arial"/>
+                <w:rFonts w:asciiTheme="minorHAnsi" w:hAnsiTheme="minorHAnsi" w:cstheme="minorHAnsi"/>
                 <w:b/>
                 <w:sz w:val="22"/>
                 <w:szCs w:val="18"/>
@@ -1074,7 +1184,7 @@
             </w:r>
             <w:r>
               <w:rPr>
-                <w:rFonts w:ascii="Calibri" w:hAnsi="Calibri" w:cs="Arial"/>
+                <w:rFonts w:asciiTheme="minorHAnsi" w:hAnsiTheme="minorHAnsi" w:cstheme="minorHAnsi"/>
                 <w:b/>
                 <w:sz w:val="22"/>
                 <w:szCs w:val="18"/>
@@ -1083,7 +1193,7 @@
             </w:r>
             <w:r>
               <w:rPr>
-                <w:rFonts w:ascii="Calibri" w:hAnsi="Calibri" w:cs="Arial"/>
+                <w:rFonts w:asciiTheme="minorHAnsi" w:hAnsiTheme="minorHAnsi" w:cstheme="minorHAnsi"/>
                 <w:b/>
                 <w:sz w:val="22"/>
                 <w:szCs w:val="18"/>
@@ -1092,7 +1202,7 @@
             </w:r>
             <w:r>
               <w:rPr>
-                <w:rFonts w:ascii="Calibri" w:hAnsi="Calibri" w:cs="Arial"/>
+                <w:rFonts w:asciiTheme="minorHAnsi" w:hAnsiTheme="minorHAnsi" w:cstheme="minorHAnsi"/>
                 <w:b/>
                 <w:sz w:val="22"/>
                 <w:szCs w:val="18"/>
@@ -1101,7 +1211,7 @@
             </w:r>
             <w:r>
               <w:rPr>
-                <w:rFonts w:ascii="Calibri" w:hAnsi="Calibri" w:cs="Arial"/>
+                <w:rFonts w:asciiTheme="minorHAnsi" w:hAnsiTheme="minorHAnsi" w:cstheme="minorHAnsi"/>
                 <w:b/>
                 <w:sz w:val="22"/>
                 <w:szCs w:val="18"/>
@@ -1113,7 +1223,7 @@
             <w:pPr>
               <w:pStyle w:val="GvdeMetni2"/>
               <w:rPr>
-                <w:rFonts w:ascii="Calibri" w:hAnsi="Calibri" w:cs="Arial"/>
+                <w:rFonts w:asciiTheme="minorHAnsi" w:hAnsiTheme="minorHAnsi" w:cstheme="minorHAnsi"/>
                 <w:b/>
                 <w:sz w:val="22"/>
                 <w:szCs w:val="18"/>
@@ -1124,12 +1234,13 @@
             <w:pPr>
               <w:pStyle w:val="GvdeMetni2"/>
               <w:rPr>
+                <w:rFonts w:asciiTheme="minorHAnsi" w:hAnsiTheme="minorHAnsi" w:cstheme="minorHAnsi"/>
                 <w:sz w:val="28"/>
               </w:rPr>
             </w:pPr>
             <w:r>
               <w:rPr>
-                <w:rFonts w:ascii="Calibri" w:hAnsi="Calibri" w:cs="Arial"/>
+                <w:rFonts w:asciiTheme="minorHAnsi" w:hAnsiTheme="minorHAnsi" w:cstheme="minorHAnsi"/>
                 <w:b/>
                 <w:sz w:val="22"/>
                 <w:szCs w:val="18"/>
@@ -1138,7 +1249,7 @@
             </w:r>
             <w:r>
               <w:rPr>
-                <w:rFonts w:ascii="Calibri" w:hAnsi="Calibri" w:cs="Arial"/>
+                <w:rFonts w:asciiTheme="minorHAnsi" w:hAnsiTheme="minorHAnsi" w:cstheme="minorHAnsi"/>
                 <w:b/>
                 <w:sz w:val="22"/>
                 <w:szCs w:val="18"/>
@@ -1147,7 +1258,7 @@
             </w:r>
             <w:r>
               <w:rPr>
-                <w:rFonts w:ascii="Calibri" w:hAnsi="Calibri" w:cs="Arial"/>
+                <w:rFonts w:asciiTheme="minorHAnsi" w:hAnsiTheme="minorHAnsi" w:cstheme="minorHAnsi"/>
                 <w:b/>
                 <w:sz w:val="22"/>
                 <w:szCs w:val="18"/>
@@ -1156,7 +1267,7 @@
             </w:r>
             <w:r>
               <w:rPr>
-                <w:rFonts w:ascii="Calibri" w:hAnsi="Calibri" w:cs="Arial"/>
+                <w:rFonts w:asciiTheme="minorHAnsi" w:hAnsiTheme="minorHAnsi" w:cstheme="minorHAnsi"/>
                 <w:b/>
                 <w:sz w:val="22"/>
                 <w:szCs w:val="18"/>
@@ -1165,7 +1276,7 @@
             </w:r>
             <w:r>
               <w:rPr>
-                <w:rFonts w:ascii="Calibri" w:hAnsi="Calibri" w:cs="Arial"/>
+                <w:rFonts w:asciiTheme="minorHAnsi" w:hAnsiTheme="minorHAnsi" w:cstheme="minorHAnsi"/>
                 <w:b/>
                 <w:sz w:val="22"/>
                 <w:szCs w:val="18"/>
@@ -1174,7 +1285,7 @@
             </w:r>
             <w:r>
               <w:rPr>
-                <w:rFonts w:ascii="Calibri" w:hAnsi="Calibri" w:cs="Arial"/>
+                <w:rFonts w:asciiTheme="minorHAnsi" w:hAnsiTheme="minorHAnsi" w:cstheme="minorHAnsi"/>
                 <w:b/>
                 <w:sz w:val="22"/>
                 <w:szCs w:val="18"/>
@@ -1183,7 +1294,7 @@
             </w:r>
             <w:r>
               <w:rPr>
-                <w:rFonts w:ascii="Calibri" w:hAnsi="Calibri" w:cs="Arial"/>
+                <w:rFonts w:asciiTheme="minorHAnsi" w:hAnsiTheme="minorHAnsi" w:cstheme="minorHAnsi"/>
                 <w:b/>
                 <w:sz w:val="22"/>
                 <w:szCs w:val="18"/>
@@ -1193,7 +1304,7 @@
             <w:bookmarkStart w:id="0" w:name="_Hlk112193330"/>
             <w:r>
               <w:rPr>
-                <w:rFonts w:ascii="Calibri" w:hAnsi="Calibri" w:cs="Arial"/>
+                <w:rFonts w:asciiTheme="minorHAnsi" w:hAnsiTheme="minorHAnsi" w:cstheme="minorHAnsi"/>
                 <w:b/>
                 <w:sz w:val="22"/>
                 <w:szCs w:val="18"/>
@@ -1202,7 +1313,7 @@
             </w:r>
             <w:r>
               <w:rPr>
-                <w:rFonts w:ascii="Calibri" w:hAnsi="Calibri" w:cs="Arial"/>
+                <w:rFonts w:asciiTheme="minorHAnsi" w:hAnsiTheme="minorHAnsi" w:cstheme="minorHAnsi"/>
                 <w:b/>
                 <w:sz w:val="22"/>
                 <w:szCs w:val="18"/>
@@ -1211,7 +1322,7 @@
             </w:r>
             <w:r>
               <w:rPr>
-                <w:rFonts w:ascii="Calibri" w:hAnsi="Calibri" w:cs="Arial"/>
+                <w:rFonts w:asciiTheme="minorHAnsi" w:hAnsiTheme="minorHAnsi" w:cstheme="minorHAnsi"/>
                 <w:b/>
                 <w:sz w:val="22"/>
                 <w:szCs w:val="18"/>
@@ -1220,7 +1331,7 @@
             </w:r>
             <w:r>
               <w:rPr>
-                <w:rFonts w:ascii="Calibri" w:hAnsi="Calibri" w:cs="Arial"/>
+                <w:rFonts w:asciiTheme="minorHAnsi" w:hAnsiTheme="minorHAnsi" w:cstheme="minorHAnsi"/>
                 <w:b/>
                 <w:sz w:val="22"/>
                 <w:szCs w:val="18"/>
@@ -1229,7 +1340,7 @@
             </w:r>
             <w:r>
               <w:rPr>
-                <w:rFonts w:ascii="Calibri" w:hAnsi="Calibri" w:cs="Arial"/>
+                <w:rFonts w:asciiTheme="minorHAnsi" w:hAnsiTheme="minorHAnsi" w:cstheme="minorHAnsi"/>
                 <w:b/>
                 <w:sz w:val="22"/>
                 <w:szCs w:val="18"/>
@@ -1242,17 +1353,7 @@
             <w:pPr>
               <w:pStyle w:val="GvdeMetni2"/>
               <w:rPr>
-                <w:rFonts w:ascii="Calibri" w:hAnsi="Calibri" w:cs="Arial"/>
-                <w:sz w:val="22"/>
-                <w:szCs w:val="18"/>
-              </w:rPr>
-            </w:pPr>
-          </w:p>
-          <w:p>
-            <w:pPr>
-              <w:pStyle w:val="GvdeMetni2"/>
-              <w:rPr>
-                <w:rFonts w:ascii="Calibri" w:hAnsi="Calibri" w:cs="Arial"/>
+                <w:rFonts w:asciiTheme="minorHAnsi" w:hAnsiTheme="minorHAnsi" w:cstheme="minorHAnsi"/>
                 <w:b/>
                 <w:sz w:val="22"/>
                 <w:szCs w:val="18"/>
@@ -1269,13 +1370,12 @@
         <w:tc>
           <w:tcPr>
             <w:tcW w:w="10910" w:type="dxa"/>
-            <w:shd w:val="clear" w:color="auto" w:fill="auto"/>
           </w:tcPr>
           <w:p>
             <w:pPr>
               <w:pStyle w:val="GvdeMetni2"/>
               <w:rPr>
-                <w:rFonts w:ascii="Calibri" w:hAnsi="Calibri" w:cs="Arial"/>
+                <w:rFonts w:asciiTheme="minorHAnsi" w:hAnsiTheme="minorHAnsi" w:cstheme="minorHAnsi"/>
                 <w:b/>
                 <w:sz w:val="22"/>
                 <w:szCs w:val="18"/>
@@ -1286,45 +1386,50 @@
             <w:pPr>
               <w:pStyle w:val="GvdeMetni2"/>
               <w:rPr>
-                <w:rFonts w:ascii="Calibri" w:hAnsi="Calibri" w:cs="Arial"/>
-                <w:b/>
-                <w:sz w:val="22"/>
-                <w:szCs w:val="18"/>
-              </w:rPr>
-            </w:pPr>
-            <w:r>
-              <w:rPr>
-                <w:rFonts w:ascii="Calibri" w:hAnsi="Calibri" w:cs="Arial"/>
-                <w:b/>
-                <w:sz w:val="22"/>
-                <w:szCs w:val="18"/>
+                <w:rFonts w:asciiTheme="minorHAnsi" w:hAnsiTheme="minorHAnsi" w:cstheme="minorHAnsi"/>
+                <w:b/>
+                <w:sz w:val="22"/>
+                <w:szCs w:val="18"/>
+                <w:u w:val="single"/>
+              </w:rPr>
+            </w:pPr>
+            <w:r>
+              <w:rPr>
+                <w:rFonts w:asciiTheme="minorHAnsi" w:hAnsiTheme="minorHAnsi" w:cstheme="minorHAnsi"/>
+                <w:b/>
+                <w:sz w:val="22"/>
+                <w:szCs w:val="18"/>
+                <w:u w:val="single"/>
               </w:rPr>
               <w:t xml:space="preserve">Sertifikalı </w:t>
             </w:r>
             <w:r>
               <w:rPr>
-                <w:rFonts w:ascii="Calibri" w:hAnsi="Calibri" w:cs="Arial"/>
-                <w:b/>
-                <w:sz w:val="22"/>
-                <w:szCs w:val="18"/>
+                <w:rFonts w:asciiTheme="minorHAnsi" w:hAnsiTheme="minorHAnsi" w:cstheme="minorHAnsi"/>
+                <w:b/>
+                <w:sz w:val="22"/>
+                <w:szCs w:val="18"/>
+                <w:u w:val="single"/>
               </w:rPr>
               <w:t>Firma Yetki</w:t>
             </w:r>
             <w:r>
               <w:rPr>
-                <w:rFonts w:ascii="Calibri" w:hAnsi="Calibri" w:cs="Arial"/>
-                <w:b/>
-                <w:sz w:val="22"/>
-                <w:szCs w:val="18"/>
+                <w:rFonts w:asciiTheme="minorHAnsi" w:hAnsiTheme="minorHAnsi" w:cstheme="minorHAnsi"/>
+                <w:b/>
+                <w:sz w:val="22"/>
+                <w:szCs w:val="18"/>
+                <w:u w:val="single"/>
               </w:rPr>
               <w:t>li</w:t>
             </w:r>
             <w:r>
               <w:rPr>
-                <w:rFonts w:ascii="Calibri" w:hAnsi="Calibri" w:cs="Arial"/>
-                <w:b/>
-                <w:sz w:val="22"/>
-                <w:szCs w:val="18"/>
+                <w:rFonts w:asciiTheme="minorHAnsi" w:hAnsiTheme="minorHAnsi" w:cstheme="minorHAnsi"/>
+                <w:b/>
+                <w:sz w:val="22"/>
+                <w:szCs w:val="18"/>
+                <w:u w:val="single"/>
               </w:rPr>
               <w:t>si</w:t>
             </w:r>
@@ -1333,7 +1438,7 @@
             <w:pPr>
               <w:pStyle w:val="GvdeMetni2"/>
               <w:rPr>
-                <w:rFonts w:ascii="Calibri" w:hAnsi="Calibri" w:cs="Arial"/>
+                <w:rFonts w:asciiTheme="minorHAnsi" w:hAnsiTheme="minorHAnsi" w:cstheme="minorHAnsi"/>
                 <w:b/>
                 <w:sz w:val="22"/>
                 <w:szCs w:val="18"/>
@@ -1344,15 +1449,15 @@
             <w:pPr>
               <w:pStyle w:val="GvdeMetni2"/>
               <w:rPr>
-                <w:rFonts w:ascii="Calibri" w:hAnsi="Calibri" w:cs="Arial"/>
-                <w:b/>
-                <w:sz w:val="22"/>
-                <w:szCs w:val="18"/>
-              </w:rPr>
-            </w:pPr>
-            <w:r>
-              <w:rPr>
-                <w:rFonts w:ascii="Calibri" w:hAnsi="Calibri" w:cs="Arial"/>
+                <w:rFonts w:asciiTheme="minorHAnsi" w:hAnsiTheme="minorHAnsi" w:cstheme="minorHAnsi"/>
+                <w:b/>
+                <w:sz w:val="22"/>
+                <w:szCs w:val="18"/>
+              </w:rPr>
+            </w:pPr>
+            <w:r>
+              <w:rPr>
+                <w:rFonts w:asciiTheme="minorHAnsi" w:hAnsiTheme="minorHAnsi" w:cstheme="minorHAnsi"/>
                 <w:b/>
                 <w:sz w:val="22"/>
                 <w:szCs w:val="18"/>
@@ -1365,15 +1470,15 @@
               <w:pStyle w:val="GvdeMetni2"/>
               <w:jc w:val="left"/>
               <w:rPr>
-                <w:rFonts w:ascii="Calibri" w:hAnsi="Calibri" w:cs="Arial"/>
-                <w:b/>
-                <w:sz w:val="22"/>
-                <w:szCs w:val="18"/>
-              </w:rPr>
-            </w:pPr>
-            <w:r>
-              <w:rPr>
-                <w:rFonts w:ascii="Calibri" w:hAnsi="Calibri" w:cs="Arial"/>
+                <w:rFonts w:asciiTheme="minorHAnsi" w:hAnsiTheme="minorHAnsi" w:cstheme="minorHAnsi"/>
+                <w:b/>
+                <w:sz w:val="22"/>
+                <w:szCs w:val="18"/>
+              </w:rPr>
+            </w:pPr>
+            <w:r>
+              <w:rPr>
+                <w:rFonts w:asciiTheme="minorHAnsi" w:hAnsiTheme="minorHAnsi" w:cstheme="minorHAnsi"/>
                 <w:b/>
                 <w:sz w:val="22"/>
                 <w:szCs w:val="18"/>
@@ -1385,15 +1490,15 @@
             <w:pPr>
               <w:pStyle w:val="GvdeMetni2"/>
               <w:rPr>
-                <w:rFonts w:ascii="Calibri" w:hAnsi="Calibri" w:cs="Arial"/>
-                <w:b/>
-                <w:sz w:val="22"/>
-                <w:szCs w:val="18"/>
-              </w:rPr>
-            </w:pPr>
-            <w:r>
-              <w:rPr>
-                <w:rFonts w:ascii="Calibri" w:hAnsi="Calibri" w:cs="Arial"/>
+                <w:rFonts w:asciiTheme="minorHAnsi" w:hAnsiTheme="minorHAnsi" w:cstheme="minorHAnsi"/>
+                <w:b/>
+                <w:sz w:val="22"/>
+                <w:szCs w:val="18"/>
+              </w:rPr>
+            </w:pPr>
+            <w:r>
+              <w:rPr>
+                <w:rFonts w:asciiTheme="minorHAnsi" w:hAnsiTheme="minorHAnsi" w:cstheme="minorHAnsi"/>
                 <w:b/>
                 <w:sz w:val="22"/>
                 <w:szCs w:val="18"/>
@@ -1406,7 +1511,7 @@
               <w:pStyle w:val="GvdeMetni2"/>
               <w:jc w:val="center"/>
               <w:rPr>
-                <w:rFonts w:ascii="Calibri" w:hAnsi="Calibri" w:cs="Arial"/>
+                <w:rFonts w:asciiTheme="minorHAnsi" w:hAnsiTheme="minorHAnsi" w:cstheme="minorHAnsi"/>
                 <w:b/>
                 <w:sz w:val="22"/>
                 <w:szCs w:val="18"/>
@@ -1416,7 +1521,13 @@
         </w:tc>
       </w:tr>
     </w:tbl>
-    <w:p/>
+    <w:p>
+      <w:pPr>
+        <w:rPr>
+          <w:rFonts w:asciiTheme="minorHAnsi" w:hAnsiTheme="minorHAnsi" w:cstheme="minorHAnsi"/>
+        </w:rPr>
+      </w:pPr>
+    </w:p>
     <w:tbl>
       <w:tblPr>
         <w:tblW w:w="10910" w:type="dxa"/>
@@ -1441,13 +1552,12 @@
         <w:tc>
           <w:tcPr>
             <w:tcW w:w="10910" w:type="dxa"/>
-            <w:shd w:val="clear" w:color="auto" w:fill="auto"/>
           </w:tcPr>
           <w:p>
             <w:pPr>
               <w:pStyle w:val="GvdeMetni2"/>
               <w:rPr>
-                <w:rFonts w:ascii="Calibri" w:hAnsi="Calibri" w:cs="Arial"/>
+                <w:rFonts w:asciiTheme="minorHAnsi" w:hAnsiTheme="minorHAnsi" w:cstheme="minorHAnsi"/>
                 <w:b/>
                 <w:sz w:val="22"/>
                 <w:szCs w:val="18"/>
@@ -1458,7 +1568,7 @@
             <w:pPr>
               <w:pStyle w:val="GvdeMetni2"/>
               <w:rPr>
-                <w:rFonts w:ascii="Calibri" w:hAnsi="Calibri" w:cs="Arial"/>
+                <w:rFonts w:asciiTheme="minorHAnsi" w:hAnsiTheme="minorHAnsi" w:cstheme="minorHAnsi"/>
                 <w:b/>
                 <w:color w:val="000000" w:themeColor="text1"/>
                 <w:sz w:val="22"/>
@@ -1467,7 +1577,7 @@
             </w:pPr>
             <w:r>
               <w:rPr>
-                <w:rFonts w:ascii="Calibri" w:hAnsi="Calibri" w:cs="Arial"/>
+                <w:rFonts w:asciiTheme="minorHAnsi" w:hAnsiTheme="minorHAnsi" w:cstheme="minorHAnsi"/>
                 <w:b/>
                 <w:color w:val="000000" w:themeColor="text1"/>
                 <w:sz w:val="22"/>
@@ -1480,7 +1590,7 @@
             <w:pPr>
               <w:pStyle w:val="GvdeMetni2"/>
               <w:rPr>
-                <w:rFonts w:ascii="Calibri" w:hAnsi="Calibri" w:cs="Arial"/>
+                <w:rFonts w:asciiTheme="minorHAnsi" w:hAnsiTheme="minorHAnsi" w:cstheme="minorHAnsi"/>
                 <w:b/>
                 <w:color w:val="000000" w:themeColor="text1"/>
                 <w:sz w:val="22"/>
@@ -1491,8 +1601,11 @@
           <w:p>
             <w:pPr>
               <w:pStyle w:val="GvdeMetni2"/>
-              <w:rPr>
-                <w:rFonts w:ascii="Calibri" w:hAnsi="Calibri" w:cs="Arial"/>
+              <w:tabs>
+                <w:tab w:val="left" w:pos="6510"/>
+              </w:tabs>
+              <w:rPr>
+                <w:rFonts w:asciiTheme="minorHAnsi" w:hAnsiTheme="minorHAnsi" w:cstheme="minorHAnsi"/>
                 <w:b/>
                 <w:color w:val="000000" w:themeColor="text1"/>
                 <w:sz w:val="22"/>
@@ -1501,20 +1614,45 @@
             </w:pPr>
             <w:r>
               <w:rPr>
-                <w:rFonts w:ascii="Calibri" w:hAnsi="Calibri" w:cs="Arial"/>
+                <w:rFonts w:asciiTheme="minorHAnsi" w:hAnsiTheme="minorHAnsi" w:cstheme="minorHAnsi"/>
                 <w:b/>
                 <w:color w:val="000000" w:themeColor="text1"/>
                 <w:sz w:val="22"/>
                 <w:szCs w:val="18"/>
+                <w:u w:val="single"/>
               </w:rPr>
               <w:t>İşlemi Yapan Gaz Dağıtım Şirketi Yetkilisi</w:t>
             </w:r>
+            <w:r>
+              <w:rPr>
+                <w:rFonts w:asciiTheme="minorHAnsi" w:hAnsiTheme="minorHAnsi" w:cstheme="minorHAnsi"/>
+                <w:b/>
+                <w:color w:val="000000" w:themeColor="text1"/>
+                <w:sz w:val="22"/>
+                <w:szCs w:val="18"/>
+              </w:rPr>
+              <w:tab/>
+            </w:r>
+            <w:r>
+              <w:rPr>
+                <w:rFonts w:asciiTheme="minorHAnsi" w:hAnsiTheme="minorHAnsi" w:cstheme="minorHAnsi"/>
+                <w:b/>
+                <w:color w:val="000000" w:themeColor="text1"/>
+                <w:sz w:val="22"/>
+                <w:szCs w:val="18"/>
+                <w:u w:val="single"/>
+              </w:rPr>
+              <w:t>İşlem Yapılan Abone/Kullanıcı</w:t>
+            </w:r>
           </w:p>
           <w:p>
             <w:pPr>
               <w:pStyle w:val="GvdeMetni2"/>
-              <w:rPr>
-                <w:rFonts w:ascii="Calibri" w:hAnsi="Calibri" w:cs="Arial"/>
+              <w:tabs>
+                <w:tab w:val="left" w:pos="6510"/>
+              </w:tabs>
+              <w:rPr>
+                <w:rFonts w:asciiTheme="minorHAnsi" w:hAnsiTheme="minorHAnsi" w:cstheme="minorHAnsi"/>
                 <w:b/>
                 <w:color w:val="000000" w:themeColor="text1"/>
                 <w:sz w:val="22"/>
@@ -1525,8 +1663,11 @@
           <w:p>
             <w:pPr>
               <w:pStyle w:val="GvdeMetni2"/>
-              <w:rPr>
-                <w:rFonts w:ascii="Calibri" w:hAnsi="Calibri" w:cs="Arial"/>
+              <w:tabs>
+                <w:tab w:val="left" w:pos="6540"/>
+              </w:tabs>
+              <w:rPr>
+                <w:rFonts w:asciiTheme="minorHAnsi" w:hAnsiTheme="minorHAnsi" w:cstheme="minorHAnsi"/>
                 <w:b/>
                 <w:color w:val="000000" w:themeColor="text1"/>
                 <w:sz w:val="22"/>
@@ -1535,7 +1676,7 @@
             </w:pPr>
             <w:r>
               <w:rPr>
-                <w:rFonts w:ascii="Calibri" w:hAnsi="Calibri" w:cs="Arial"/>
+                <w:rFonts w:asciiTheme="minorHAnsi" w:hAnsiTheme="minorHAnsi" w:cstheme="minorHAnsi"/>
                 <w:b/>
                 <w:color w:val="000000" w:themeColor="text1"/>
                 <w:sz w:val="22"/>
@@ -1543,13 +1684,27 @@
               </w:rPr>
               <w:t>Adı ve Soyadı:</w:t>
             </w:r>
+            <w:r>
+              <w:rPr>
+                <w:rFonts w:asciiTheme="minorHAnsi" w:hAnsiTheme="minorHAnsi" w:cstheme="minorHAnsi"/>
+                <w:b/>
+                <w:color w:val="000000" w:themeColor="text1"/>
+                <w:sz w:val="22"/>
+                <w:szCs w:val="18"/>
+              </w:rPr>
+              <w:tab/>
+              <w:t>Adı ve Soyadı:</w:t>
+            </w:r>
           </w:p>
           <w:p>
             <w:pPr>
               <w:pStyle w:val="GvdeMetni2"/>
+              <w:tabs>
+                <w:tab w:val="left" w:pos="6540"/>
+              </w:tabs>
               <w:jc w:val="left"/>
               <w:rPr>
-                <w:rFonts w:ascii="Calibri" w:hAnsi="Calibri" w:cs="Arial"/>
+                <w:rFonts w:asciiTheme="minorHAnsi" w:hAnsiTheme="minorHAnsi" w:cstheme="minorHAnsi"/>
                 <w:b/>
                 <w:color w:val="000000" w:themeColor="text1"/>
                 <w:sz w:val="22"/>
@@ -1558,7 +1713,7 @@
             </w:pPr>
             <w:r>
               <w:rPr>
-                <w:rFonts w:ascii="Calibri" w:hAnsi="Calibri" w:cs="Arial"/>
+                <w:rFonts w:asciiTheme="minorHAnsi" w:hAnsiTheme="minorHAnsi" w:cstheme="minorHAnsi"/>
                 <w:b/>
                 <w:color w:val="000000" w:themeColor="text1"/>
                 <w:sz w:val="22"/>
@@ -1566,12 +1721,23 @@
               </w:rPr>
               <w:t>Tarih:</w:t>
             </w:r>
+            <w:r>
+              <w:rPr>
+                <w:rFonts w:asciiTheme="minorHAnsi" w:hAnsiTheme="minorHAnsi" w:cstheme="minorHAnsi"/>
+                <w:b/>
+                <w:color w:val="000000" w:themeColor="text1"/>
+                <w:sz w:val="22"/>
+                <w:szCs w:val="18"/>
+              </w:rPr>
+              <w:tab/>
+              <w:t>İmza:</w:t>
+            </w:r>
           </w:p>
           <w:p>
             <w:pPr>
               <w:pStyle w:val="GvdeMetni2"/>
               <w:rPr>
-                <w:rFonts w:ascii="Calibri" w:hAnsi="Calibri" w:cs="Arial"/>
+                <w:rFonts w:asciiTheme="minorHAnsi" w:hAnsiTheme="minorHAnsi" w:cstheme="minorHAnsi"/>
                 <w:b/>
                 <w:color w:val="000000" w:themeColor="text1"/>
                 <w:sz w:val="22"/>
@@ -1580,7 +1746,7 @@
             </w:pPr>
             <w:r>
               <w:rPr>
-                <w:rFonts w:ascii="Calibri" w:hAnsi="Calibri" w:cs="Arial"/>
+                <w:rFonts w:asciiTheme="minorHAnsi" w:hAnsiTheme="minorHAnsi" w:cstheme="minorHAnsi"/>
                 <w:b/>
                 <w:color w:val="000000" w:themeColor="text1"/>
                 <w:sz w:val="22"/>
@@ -1589,15 +1755,1607 @@
               <w:t>İmza:</w:t>
             </w:r>
           </w:p>
-          <w:p/>
+          <w:p>
+            <w:pPr>
+              <w:rPr>
+                <w:rFonts w:asciiTheme="minorHAnsi" w:hAnsiTheme="minorHAnsi" w:cstheme="minorHAnsi"/>
+              </w:rPr>
+            </w:pPr>
+          </w:p>
         </w:tc>
       </w:tr>
     </w:tbl>
-    <w:p/>
+    <w:p>
+      <w:pPr>
+        <w:rPr>
+          <w:rFonts w:asciiTheme="minorHAnsi" w:hAnsiTheme="minorHAnsi" w:cstheme="minorHAnsi"/>
+        </w:rPr>
+      </w:pPr>
+    </w:p>
+    <w:p>
+      <w:pPr>
+        <w:rPr>
+          <w:rFonts w:asciiTheme="minorHAnsi" w:hAnsiTheme="minorHAnsi" w:cstheme="minorHAnsi"/>
+        </w:rPr>
+      </w:pPr>
+    </w:p>
+    <w:p>
+      <w:pPr>
+        <w:rPr>
+          <w:rFonts w:asciiTheme="minorHAnsi" w:hAnsiTheme="minorHAnsi" w:cstheme="minorHAnsi"/>
+        </w:rPr>
+      </w:pPr>
+      <w:r>
+        <w:rPr>
+          <w:rFonts w:asciiTheme="minorHAnsi" w:hAnsiTheme="minorHAnsi" w:cstheme="minorHAnsi"/>
+          <w:b/>
+        </w:rPr>
+        <w:t>1. KONTROL</w:t>
+      </w:r>
+    </w:p>
+    <w:p>
+      <w:pPr>
+        <w:rPr>
+          <w:rFonts w:asciiTheme="minorHAnsi" w:hAnsiTheme="minorHAnsi" w:cstheme="minorHAnsi"/>
+        </w:rPr>
+      </w:pPr>
+      <w:r>
+        <w:rPr>
+          <w:rFonts w:ascii="Segoe UI Symbol" w:hAnsi="Segoe UI Symbol" w:cs="Segoe UI Symbol"/>
+        </w:rPr>
+        <w:t>☐</w:t>
+      </w:r>
+      <w:r>
+        <w:rPr>
+          <w:rFonts w:asciiTheme="minorHAnsi" w:hAnsiTheme="minorHAnsi" w:cstheme="minorHAnsi"/>
+        </w:rPr>
+        <w:t xml:space="preserve"> Uygun      </w:t>
+      </w:r>
+      <w:r>
+        <w:rPr>
+          <w:rFonts w:ascii="Segoe UI Symbol" w:hAnsi="Segoe UI Symbol" w:cs="Segoe UI Symbol"/>
+        </w:rPr>
+        <w:t>☐</w:t>
+      </w:r>
+      <w:r>
+        <w:rPr>
+          <w:rFonts w:asciiTheme="minorHAnsi" w:hAnsiTheme="minorHAnsi" w:cstheme="minorHAnsi"/>
+        </w:rPr>
+        <w:t xml:space="preserve"> Uygun Değil</w:t>
+      </w:r>
+    </w:p>
+    <w:p>
+      <w:pPr>
+        <w:rPr>
+          <w:rFonts w:asciiTheme="minorHAnsi" w:hAnsiTheme="minorHAnsi" w:cstheme="minorHAnsi"/>
+        </w:rPr>
+      </w:pPr>
+      <w:r>
+        <w:rPr>
+          <w:rFonts w:asciiTheme="minorHAnsi" w:hAnsiTheme="minorHAnsi" w:cstheme="minorHAnsi"/>
+        </w:rPr>
+        <w:t>Uygun değil ise nedeni:</w:t>
+      </w:r>
+    </w:p>
+    <w:p>
+      <w:pPr>
+        <w:rPr>
+          <w:rFonts w:asciiTheme="minorHAnsi" w:hAnsiTheme="minorHAnsi" w:cstheme="minorHAnsi"/>
+        </w:rPr>
+      </w:pPr>
+      <w:r>
+        <w:rPr>
+          <w:rFonts w:asciiTheme="minorHAnsi" w:hAnsiTheme="minorHAnsi" w:cstheme="minorHAnsi"/>
+        </w:rPr>
+        <w:t>................................................................................</w:t>
+      </w:r>
+    </w:p>
+    <w:tbl>
+      <w:tblPr>
+        <w:tblStyle w:val="TabloKlavuzu"/>
+        <w:tblW w:w="0" w:type="auto"/>
+        <w:tblLook w:val="04A0" w:firstRow="1" w:lastRow="0" w:firstColumn="1" w:lastColumn="0" w:noHBand="0" w:noVBand="1"/>
+      </w:tblPr>
+      <w:tblGrid>
+        <w:gridCol w:w="3588"/>
+        <w:gridCol w:w="3587"/>
+        <w:gridCol w:w="3587"/>
+      </w:tblGrid>
+      <w:tr>
+        <w:tc>
+          <w:tcPr>
+            <w:tcW w:w="3591" w:type="dxa"/>
+          </w:tcPr>
+          <w:p>
+            <w:pPr>
+              <w:rPr>
+                <w:rFonts w:asciiTheme="minorHAnsi" w:hAnsiTheme="minorHAnsi" w:cstheme="minorHAnsi"/>
+              </w:rPr>
+            </w:pPr>
+            <w:r>
+              <w:rPr>
+                <w:rFonts w:asciiTheme="minorHAnsi" w:hAnsiTheme="minorHAnsi" w:cstheme="minorHAnsi"/>
+              </w:rPr>
+              <w:t>Gaz Dağıtım Şirketi Yetkilisi</w:t>
+            </w:r>
+          </w:p>
+        </w:tc>
+        <w:tc>
+          <w:tcPr>
+            <w:tcW w:w="3591" w:type="dxa"/>
+          </w:tcPr>
+          <w:p>
+            <w:pPr>
+              <w:rPr>
+                <w:rFonts w:asciiTheme="minorHAnsi" w:hAnsiTheme="minorHAnsi" w:cstheme="minorHAnsi"/>
+              </w:rPr>
+            </w:pPr>
+            <w:r>
+              <w:rPr>
+                <w:rFonts w:asciiTheme="minorHAnsi" w:hAnsiTheme="minorHAnsi" w:cstheme="minorHAnsi"/>
+              </w:rPr>
+              <w:t>Abone / Kullanıcı</w:t>
+            </w:r>
+          </w:p>
+        </w:tc>
+        <w:tc>
+          <w:tcPr>
+            <w:tcW w:w="3591" w:type="dxa"/>
+          </w:tcPr>
+          <w:p>
+            <w:pPr>
+              <w:rPr>
+                <w:rFonts w:asciiTheme="minorHAnsi" w:hAnsiTheme="minorHAnsi" w:cstheme="minorHAnsi"/>
+              </w:rPr>
+            </w:pPr>
+            <w:r>
+              <w:rPr>
+                <w:rFonts w:asciiTheme="minorHAnsi" w:hAnsiTheme="minorHAnsi" w:cstheme="minorHAnsi"/>
+              </w:rPr>
+              <w:t>Sertifikalı Firma</w:t>
+            </w:r>
+          </w:p>
+        </w:tc>
+      </w:tr>
+      <w:tr>
+        <w:tc>
+          <w:tcPr>
+            <w:tcW w:w="3591" w:type="dxa"/>
+          </w:tcPr>
+          <w:p>
+            <w:pPr>
+              <w:rPr>
+                <w:rFonts w:asciiTheme="minorHAnsi" w:hAnsiTheme="minorHAnsi" w:cstheme="minorHAnsi"/>
+              </w:rPr>
+            </w:pPr>
+            <w:r>
+              <w:rPr>
+                <w:rFonts w:asciiTheme="minorHAnsi" w:hAnsiTheme="minorHAnsi" w:cstheme="minorHAnsi"/>
+              </w:rPr>
+              <w:t>Adı Soyadı</w:t>
+            </w:r>
+          </w:p>
+        </w:tc>
+        <w:tc>
+          <w:tcPr>
+            <w:tcW w:w="3591" w:type="dxa"/>
+          </w:tcPr>
+          <w:p>
+            <w:pPr>
+              <w:rPr>
+                <w:rFonts w:asciiTheme="minorHAnsi" w:hAnsiTheme="minorHAnsi" w:cstheme="minorHAnsi"/>
+              </w:rPr>
+            </w:pPr>
+            <w:r>
+              <w:rPr>
+                <w:rFonts w:asciiTheme="minorHAnsi" w:hAnsiTheme="minorHAnsi" w:cstheme="minorHAnsi"/>
+              </w:rPr>
+              <w:t>Adı Soyadı</w:t>
+            </w:r>
+          </w:p>
+        </w:tc>
+        <w:tc>
+          <w:tcPr>
+            <w:tcW w:w="3591" w:type="dxa"/>
+          </w:tcPr>
+          <w:p>
+            <w:pPr>
+              <w:rPr>
+                <w:rFonts w:asciiTheme="minorHAnsi" w:hAnsiTheme="minorHAnsi" w:cstheme="minorHAnsi"/>
+              </w:rPr>
+            </w:pPr>
+            <w:r>
+              <w:rPr>
+                <w:rFonts w:asciiTheme="minorHAnsi" w:hAnsiTheme="minorHAnsi" w:cstheme="minorHAnsi"/>
+              </w:rPr>
+              <w:t>Firma / Yetkili</w:t>
+            </w:r>
+          </w:p>
+        </w:tc>
+      </w:tr>
+      <w:tr>
+        <w:tc>
+          <w:tcPr>
+            <w:tcW w:w="3591" w:type="dxa"/>
+          </w:tcPr>
+          <w:p>
+            <w:pPr>
+              <w:rPr>
+                <w:rFonts w:asciiTheme="minorHAnsi" w:hAnsiTheme="minorHAnsi" w:cstheme="minorHAnsi"/>
+              </w:rPr>
+            </w:pPr>
+            <w:r>
+              <w:rPr>
+                <w:rFonts w:asciiTheme="minorHAnsi" w:hAnsiTheme="minorHAnsi" w:cstheme="minorHAnsi"/>
+              </w:rPr>
+              <w:t>Tarih</w:t>
+            </w:r>
+          </w:p>
+        </w:tc>
+        <w:tc>
+          <w:tcPr>
+            <w:tcW w:w="3591" w:type="dxa"/>
+          </w:tcPr>
+          <w:p>
+            <w:pPr>
+              <w:rPr>
+                <w:rFonts w:asciiTheme="minorHAnsi" w:hAnsiTheme="minorHAnsi" w:cstheme="minorHAnsi"/>
+              </w:rPr>
+            </w:pPr>
+            <w:r>
+              <w:rPr>
+                <w:rFonts w:asciiTheme="minorHAnsi" w:hAnsiTheme="minorHAnsi" w:cstheme="minorHAnsi"/>
+              </w:rPr>
+              <w:t>Tarih</w:t>
+            </w:r>
+          </w:p>
+        </w:tc>
+        <w:tc>
+          <w:tcPr>
+            <w:tcW w:w="3591" w:type="dxa"/>
+          </w:tcPr>
+          <w:p>
+            <w:pPr>
+              <w:rPr>
+                <w:rFonts w:asciiTheme="minorHAnsi" w:hAnsiTheme="minorHAnsi" w:cstheme="minorHAnsi"/>
+              </w:rPr>
+            </w:pPr>
+            <w:r>
+              <w:rPr>
+                <w:rFonts w:asciiTheme="minorHAnsi" w:hAnsiTheme="minorHAnsi" w:cstheme="minorHAnsi"/>
+              </w:rPr>
+              <w:t>Tarih</w:t>
+            </w:r>
+          </w:p>
+        </w:tc>
+      </w:tr>
+      <w:tr>
+        <w:tc>
+          <w:tcPr>
+            <w:tcW w:w="3591" w:type="dxa"/>
+          </w:tcPr>
+          <w:p>
+            <w:pPr>
+              <w:rPr>
+                <w:rFonts w:asciiTheme="minorHAnsi" w:hAnsiTheme="minorHAnsi" w:cstheme="minorHAnsi"/>
+              </w:rPr>
+            </w:pPr>
+            <w:r>
+              <w:rPr>
+                <w:rFonts w:asciiTheme="minorHAnsi" w:hAnsiTheme="minorHAnsi" w:cstheme="minorHAnsi"/>
+              </w:rPr>
+              <w:t>İmza</w:t>
+            </w:r>
+          </w:p>
+        </w:tc>
+        <w:tc>
+          <w:tcPr>
+            <w:tcW w:w="3591" w:type="dxa"/>
+          </w:tcPr>
+          <w:p>
+            <w:pPr>
+              <w:rPr>
+                <w:rFonts w:asciiTheme="minorHAnsi" w:hAnsiTheme="minorHAnsi" w:cstheme="minorHAnsi"/>
+              </w:rPr>
+            </w:pPr>
+            <w:r>
+              <w:rPr>
+                <w:rFonts w:asciiTheme="minorHAnsi" w:hAnsiTheme="minorHAnsi" w:cstheme="minorHAnsi"/>
+              </w:rPr>
+              <w:t>İmza</w:t>
+            </w:r>
+          </w:p>
+        </w:tc>
+        <w:tc>
+          <w:tcPr>
+            <w:tcW w:w="3591" w:type="dxa"/>
+          </w:tcPr>
+          <w:p>
+            <w:pPr>
+              <w:rPr>
+                <w:rFonts w:asciiTheme="minorHAnsi" w:hAnsiTheme="minorHAnsi" w:cstheme="minorHAnsi"/>
+              </w:rPr>
+            </w:pPr>
+            <w:r>
+              <w:rPr>
+                <w:rFonts w:asciiTheme="minorHAnsi" w:hAnsiTheme="minorHAnsi" w:cstheme="minorHAnsi"/>
+              </w:rPr>
+              <w:t>Kaşe / İmza</w:t>
+            </w:r>
+          </w:p>
+        </w:tc>
+      </w:tr>
+    </w:tbl>
+    <w:p>
+      <w:pPr>
+        <w:rPr>
+          <w:rFonts w:asciiTheme="minorHAnsi" w:hAnsiTheme="minorHAnsi" w:cstheme="minorHAnsi"/>
+        </w:rPr>
+      </w:pPr>
+    </w:p>
+    <w:p>
+      <w:pPr>
+        <w:rPr>
+          <w:rFonts w:asciiTheme="minorHAnsi" w:hAnsiTheme="minorHAnsi" w:cstheme="minorHAnsi"/>
+        </w:rPr>
+      </w:pPr>
+      <w:r>
+        <w:rPr>
+          <w:rFonts w:asciiTheme="minorHAnsi" w:hAnsiTheme="minorHAnsi" w:cstheme="minorHAnsi"/>
+          <w:b/>
+        </w:rPr>
+        <w:t>2. KONTROL</w:t>
+      </w:r>
+    </w:p>
+    <w:p>
+      <w:pPr>
+        <w:rPr>
+          <w:rFonts w:asciiTheme="minorHAnsi" w:hAnsiTheme="minorHAnsi" w:cstheme="minorHAnsi"/>
+        </w:rPr>
+      </w:pPr>
+      <w:r>
+        <w:rPr>
+          <w:rFonts w:ascii="Segoe UI Symbol" w:hAnsi="Segoe UI Symbol" w:cs="Segoe UI Symbol"/>
+        </w:rPr>
+        <w:t>☐</w:t>
+      </w:r>
+      <w:r>
+        <w:rPr>
+          <w:rFonts w:asciiTheme="minorHAnsi" w:hAnsiTheme="minorHAnsi" w:cstheme="minorHAnsi"/>
+        </w:rPr>
+        <w:t xml:space="preserve"> Uygun      </w:t>
+      </w:r>
+      <w:r>
+        <w:rPr>
+          <w:rFonts w:ascii="Segoe UI Symbol" w:hAnsi="Segoe UI Symbol" w:cs="Segoe UI Symbol"/>
+        </w:rPr>
+        <w:t>☐</w:t>
+      </w:r>
+      <w:r>
+        <w:rPr>
+          <w:rFonts w:asciiTheme="minorHAnsi" w:hAnsiTheme="minorHAnsi" w:cstheme="minorHAnsi"/>
+        </w:rPr>
+        <w:t xml:space="preserve"> Uygun Değil</w:t>
+      </w:r>
+    </w:p>
+    <w:p>
+      <w:pPr>
+        <w:rPr>
+          <w:rFonts w:asciiTheme="minorHAnsi" w:hAnsiTheme="minorHAnsi" w:cstheme="minorHAnsi"/>
+        </w:rPr>
+      </w:pPr>
+      <w:r>
+        <w:rPr>
+          <w:rFonts w:asciiTheme="minorHAnsi" w:hAnsiTheme="minorHAnsi" w:cstheme="minorHAnsi"/>
+        </w:rPr>
+        <w:t>Uygun değil ise nedeni:</w:t>
+      </w:r>
+    </w:p>
+    <w:p>
+      <w:pPr>
+        <w:rPr>
+          <w:rFonts w:asciiTheme="minorHAnsi" w:hAnsiTheme="minorHAnsi" w:cstheme="minorHAnsi"/>
+        </w:rPr>
+      </w:pPr>
+      <w:r>
+        <w:rPr>
+          <w:rFonts w:asciiTheme="minorHAnsi" w:hAnsiTheme="minorHAnsi" w:cstheme="minorHAnsi"/>
+        </w:rPr>
+        <w:t>................................................................................</w:t>
+      </w:r>
+    </w:p>
+    <w:tbl>
+      <w:tblPr>
+        <w:tblStyle w:val="TabloKlavuzu"/>
+        <w:tblW w:w="0" w:type="auto"/>
+        <w:tblLook w:val="04A0" w:firstRow="1" w:lastRow="0" w:firstColumn="1" w:lastColumn="0" w:noHBand="0" w:noVBand="1"/>
+      </w:tblPr>
+      <w:tblGrid>
+        <w:gridCol w:w="3588"/>
+        <w:gridCol w:w="3587"/>
+        <w:gridCol w:w="3587"/>
+      </w:tblGrid>
+      <w:tr>
+        <w:tc>
+          <w:tcPr>
+            <w:tcW w:w="3591" w:type="dxa"/>
+          </w:tcPr>
+          <w:p>
+            <w:pPr>
+              <w:rPr>
+                <w:rFonts w:asciiTheme="minorHAnsi" w:hAnsiTheme="minorHAnsi" w:cstheme="minorHAnsi"/>
+              </w:rPr>
+            </w:pPr>
+            <w:r>
+              <w:rPr>
+                <w:rFonts w:asciiTheme="minorHAnsi" w:hAnsiTheme="minorHAnsi" w:cstheme="minorHAnsi"/>
+              </w:rPr>
+              <w:t>Gaz Dağıtım Şirketi Yetkilisi</w:t>
+            </w:r>
+          </w:p>
+        </w:tc>
+        <w:tc>
+          <w:tcPr>
+            <w:tcW w:w="3591" w:type="dxa"/>
+          </w:tcPr>
+          <w:p>
+            <w:pPr>
+              <w:rPr>
+                <w:rFonts w:asciiTheme="minorHAnsi" w:hAnsiTheme="minorHAnsi" w:cstheme="minorHAnsi"/>
+              </w:rPr>
+            </w:pPr>
+            <w:r>
+              <w:rPr>
+                <w:rFonts w:asciiTheme="minorHAnsi" w:hAnsiTheme="minorHAnsi" w:cstheme="minorHAnsi"/>
+              </w:rPr>
+              <w:t>Abone / Kullanıcı</w:t>
+            </w:r>
+          </w:p>
+        </w:tc>
+        <w:tc>
+          <w:tcPr>
+            <w:tcW w:w="3591" w:type="dxa"/>
+          </w:tcPr>
+          <w:p>
+            <w:pPr>
+              <w:rPr>
+                <w:rFonts w:asciiTheme="minorHAnsi" w:hAnsiTheme="minorHAnsi" w:cstheme="minorHAnsi"/>
+              </w:rPr>
+            </w:pPr>
+            <w:r>
+              <w:rPr>
+                <w:rFonts w:asciiTheme="minorHAnsi" w:hAnsiTheme="minorHAnsi" w:cstheme="minorHAnsi"/>
+              </w:rPr>
+              <w:t>Sertifikalı Firma</w:t>
+            </w:r>
+          </w:p>
+        </w:tc>
+      </w:tr>
+      <w:tr>
+        <w:tc>
+          <w:tcPr>
+            <w:tcW w:w="3591" w:type="dxa"/>
+          </w:tcPr>
+          <w:p>
+            <w:pPr>
+              <w:rPr>
+                <w:rFonts w:asciiTheme="minorHAnsi" w:hAnsiTheme="minorHAnsi" w:cstheme="minorHAnsi"/>
+              </w:rPr>
+            </w:pPr>
+            <w:r>
+              <w:rPr>
+                <w:rFonts w:asciiTheme="minorHAnsi" w:hAnsiTheme="minorHAnsi" w:cstheme="minorHAnsi"/>
+              </w:rPr>
+              <w:t>Adı Soyadı</w:t>
+            </w:r>
+          </w:p>
+        </w:tc>
+        <w:tc>
+          <w:tcPr>
+            <w:tcW w:w="3591" w:type="dxa"/>
+          </w:tcPr>
+          <w:p>
+            <w:pPr>
+              <w:rPr>
+                <w:rFonts w:asciiTheme="minorHAnsi" w:hAnsiTheme="minorHAnsi" w:cstheme="minorHAnsi"/>
+              </w:rPr>
+            </w:pPr>
+            <w:r>
+              <w:rPr>
+                <w:rFonts w:asciiTheme="minorHAnsi" w:hAnsiTheme="minorHAnsi" w:cstheme="minorHAnsi"/>
+              </w:rPr>
+              <w:t>Adı Soyadı</w:t>
+            </w:r>
+          </w:p>
+        </w:tc>
+        <w:tc>
+          <w:tcPr>
+            <w:tcW w:w="3591" w:type="dxa"/>
+          </w:tcPr>
+          <w:p>
+            <w:pPr>
+              <w:rPr>
+                <w:rFonts w:asciiTheme="minorHAnsi" w:hAnsiTheme="minorHAnsi" w:cstheme="minorHAnsi"/>
+              </w:rPr>
+            </w:pPr>
+            <w:r>
+              <w:rPr>
+                <w:rFonts w:asciiTheme="minorHAnsi" w:hAnsiTheme="minorHAnsi" w:cstheme="minorHAnsi"/>
+              </w:rPr>
+              <w:t>Firma / Yetkili</w:t>
+            </w:r>
+          </w:p>
+        </w:tc>
+      </w:tr>
+      <w:tr>
+        <w:tc>
+          <w:tcPr>
+            <w:tcW w:w="3591" w:type="dxa"/>
+          </w:tcPr>
+          <w:p>
+            <w:pPr>
+              <w:rPr>
+                <w:rFonts w:asciiTheme="minorHAnsi" w:hAnsiTheme="minorHAnsi" w:cstheme="minorHAnsi"/>
+              </w:rPr>
+            </w:pPr>
+            <w:r>
+              <w:rPr>
+                <w:rFonts w:asciiTheme="minorHAnsi" w:hAnsiTheme="minorHAnsi" w:cstheme="minorHAnsi"/>
+              </w:rPr>
+              <w:t>Tarih</w:t>
+            </w:r>
+          </w:p>
+        </w:tc>
+        <w:tc>
+          <w:tcPr>
+            <w:tcW w:w="3591" w:type="dxa"/>
+          </w:tcPr>
+          <w:p>
+            <w:pPr>
+              <w:rPr>
+                <w:rFonts w:asciiTheme="minorHAnsi" w:hAnsiTheme="minorHAnsi" w:cstheme="minorHAnsi"/>
+              </w:rPr>
+            </w:pPr>
+            <w:r>
+              <w:rPr>
+                <w:rFonts w:asciiTheme="minorHAnsi" w:hAnsiTheme="minorHAnsi" w:cstheme="minorHAnsi"/>
+              </w:rPr>
+              <w:t>Tarih</w:t>
+            </w:r>
+          </w:p>
+        </w:tc>
+        <w:tc>
+          <w:tcPr>
+            <w:tcW w:w="3591" w:type="dxa"/>
+          </w:tcPr>
+          <w:p>
+            <w:pPr>
+              <w:rPr>
+                <w:rFonts w:asciiTheme="minorHAnsi" w:hAnsiTheme="minorHAnsi" w:cstheme="minorHAnsi"/>
+              </w:rPr>
+            </w:pPr>
+            <w:r>
+              <w:rPr>
+                <w:rFonts w:asciiTheme="minorHAnsi" w:hAnsiTheme="minorHAnsi" w:cstheme="minorHAnsi"/>
+              </w:rPr>
+              <w:t>Tarih</w:t>
+            </w:r>
+          </w:p>
+        </w:tc>
+      </w:tr>
+      <w:tr>
+        <w:tc>
+          <w:tcPr>
+            <w:tcW w:w="3591" w:type="dxa"/>
+          </w:tcPr>
+          <w:p>
+            <w:pPr>
+              <w:rPr>
+                <w:rFonts w:asciiTheme="minorHAnsi" w:hAnsiTheme="minorHAnsi" w:cstheme="minorHAnsi"/>
+              </w:rPr>
+            </w:pPr>
+            <w:r>
+              <w:rPr>
+                <w:rFonts w:asciiTheme="minorHAnsi" w:hAnsiTheme="minorHAnsi" w:cstheme="minorHAnsi"/>
+              </w:rPr>
+              <w:t>İmza</w:t>
+            </w:r>
+          </w:p>
+        </w:tc>
+        <w:tc>
+          <w:tcPr>
+            <w:tcW w:w="3591" w:type="dxa"/>
+          </w:tcPr>
+          <w:p>
+            <w:pPr>
+              <w:rPr>
+                <w:rFonts w:asciiTheme="minorHAnsi" w:hAnsiTheme="minorHAnsi" w:cstheme="minorHAnsi"/>
+              </w:rPr>
+            </w:pPr>
+            <w:r>
+              <w:rPr>
+                <w:rFonts w:asciiTheme="minorHAnsi" w:hAnsiTheme="minorHAnsi" w:cstheme="minorHAnsi"/>
+              </w:rPr>
+              <w:t>İmza</w:t>
+            </w:r>
+          </w:p>
+        </w:tc>
+        <w:tc>
+          <w:tcPr>
+            <w:tcW w:w="3591" w:type="dxa"/>
+          </w:tcPr>
+          <w:p>
+            <w:pPr>
+              <w:rPr>
+                <w:rFonts w:asciiTheme="minorHAnsi" w:hAnsiTheme="minorHAnsi" w:cstheme="minorHAnsi"/>
+              </w:rPr>
+            </w:pPr>
+            <w:r>
+              <w:rPr>
+                <w:rFonts w:asciiTheme="minorHAnsi" w:hAnsiTheme="minorHAnsi" w:cstheme="minorHAnsi"/>
+              </w:rPr>
+              <w:t>Kaşe / İmza</w:t>
+            </w:r>
+          </w:p>
+        </w:tc>
+      </w:tr>
+    </w:tbl>
+    <w:p>
+      <w:pPr>
+        <w:rPr>
+          <w:rFonts w:asciiTheme="minorHAnsi" w:hAnsiTheme="minorHAnsi" w:cstheme="minorHAnsi"/>
+        </w:rPr>
+      </w:pPr>
+    </w:p>
+    <w:p>
+      <w:pPr>
+        <w:rPr>
+          <w:rFonts w:asciiTheme="minorHAnsi" w:hAnsiTheme="minorHAnsi" w:cstheme="minorHAnsi"/>
+        </w:rPr>
+      </w:pPr>
+      <w:r>
+        <w:rPr>
+          <w:rFonts w:asciiTheme="minorHAnsi" w:hAnsiTheme="minorHAnsi" w:cstheme="minorHAnsi"/>
+          <w:b/>
+        </w:rPr>
+        <w:t>3. KONTROL</w:t>
+      </w:r>
+    </w:p>
+    <w:p>
+      <w:pPr>
+        <w:rPr>
+          <w:rFonts w:asciiTheme="minorHAnsi" w:hAnsiTheme="minorHAnsi" w:cstheme="minorHAnsi"/>
+        </w:rPr>
+      </w:pPr>
+      <w:r>
+        <w:rPr>
+          <w:rFonts w:ascii="Segoe UI Symbol" w:hAnsi="Segoe UI Symbol" w:cs="Segoe UI Symbol"/>
+        </w:rPr>
+        <w:t>☐</w:t>
+      </w:r>
+      <w:r>
+        <w:rPr>
+          <w:rFonts w:asciiTheme="minorHAnsi" w:hAnsiTheme="minorHAnsi" w:cstheme="minorHAnsi"/>
+        </w:rPr>
+        <w:t xml:space="preserve"> Uygun      </w:t>
+      </w:r>
+      <w:r>
+        <w:rPr>
+          <w:rFonts w:ascii="Segoe UI Symbol" w:hAnsi="Segoe UI Symbol" w:cs="Segoe UI Symbol"/>
+        </w:rPr>
+        <w:t>☐</w:t>
+      </w:r>
+      <w:r>
+        <w:rPr>
+          <w:rFonts w:asciiTheme="minorHAnsi" w:hAnsiTheme="minorHAnsi" w:cstheme="minorHAnsi"/>
+        </w:rPr>
+        <w:t xml:space="preserve"> Uygun Değil</w:t>
+      </w:r>
+    </w:p>
+    <w:p>
+      <w:pPr>
+        <w:rPr>
+          <w:rFonts w:asciiTheme="minorHAnsi" w:hAnsiTheme="minorHAnsi" w:cstheme="minorHAnsi"/>
+        </w:rPr>
+      </w:pPr>
+      <w:r>
+        <w:rPr>
+          <w:rFonts w:asciiTheme="minorHAnsi" w:hAnsiTheme="minorHAnsi" w:cstheme="minorHAnsi"/>
+        </w:rPr>
+        <w:t>Uygun değil ise nedeni:</w:t>
+      </w:r>
+    </w:p>
+    <w:p>
+      <w:pPr>
+        <w:rPr>
+          <w:rFonts w:asciiTheme="minorHAnsi" w:hAnsiTheme="minorHAnsi" w:cstheme="minorHAnsi"/>
+        </w:rPr>
+      </w:pPr>
+      <w:r>
+        <w:rPr>
+          <w:rFonts w:asciiTheme="minorHAnsi" w:hAnsiTheme="minorHAnsi" w:cstheme="minorHAnsi"/>
+        </w:rPr>
+        <w:t>................................................................................</w:t>
+      </w:r>
+    </w:p>
+    <w:tbl>
+      <w:tblPr>
+        <w:tblStyle w:val="TabloKlavuzu"/>
+        <w:tblW w:w="0" w:type="auto"/>
+        <w:tblLook w:val="04A0" w:firstRow="1" w:lastRow="0" w:firstColumn="1" w:lastColumn="0" w:noHBand="0" w:noVBand="1"/>
+      </w:tblPr>
+      <w:tblGrid>
+        <w:gridCol w:w="3588"/>
+        <w:gridCol w:w="3587"/>
+        <w:gridCol w:w="3587"/>
+      </w:tblGrid>
+      <w:tr>
+        <w:tc>
+          <w:tcPr>
+            <w:tcW w:w="3591" w:type="dxa"/>
+          </w:tcPr>
+          <w:p>
+            <w:pPr>
+              <w:rPr>
+                <w:rFonts w:asciiTheme="minorHAnsi" w:hAnsiTheme="minorHAnsi" w:cstheme="minorHAnsi"/>
+              </w:rPr>
+            </w:pPr>
+            <w:r>
+              <w:rPr>
+                <w:rFonts w:asciiTheme="minorHAnsi" w:hAnsiTheme="minorHAnsi" w:cstheme="minorHAnsi"/>
+              </w:rPr>
+              <w:t>Gaz Dağıtım Şirketi Yetkilisi</w:t>
+            </w:r>
+          </w:p>
+        </w:tc>
+        <w:tc>
+          <w:tcPr>
+            <w:tcW w:w="3591" w:type="dxa"/>
+          </w:tcPr>
+          <w:p>
+            <w:pPr>
+              <w:rPr>
+                <w:rFonts w:asciiTheme="minorHAnsi" w:hAnsiTheme="minorHAnsi" w:cstheme="minorHAnsi"/>
+              </w:rPr>
+            </w:pPr>
+            <w:r>
+              <w:rPr>
+                <w:rFonts w:asciiTheme="minorHAnsi" w:hAnsiTheme="minorHAnsi" w:cstheme="minorHAnsi"/>
+              </w:rPr>
+              <w:t>Abone / Kullanıcı</w:t>
+            </w:r>
+          </w:p>
+        </w:tc>
+        <w:tc>
+          <w:tcPr>
+            <w:tcW w:w="3591" w:type="dxa"/>
+          </w:tcPr>
+          <w:p>
+            <w:pPr>
+              <w:rPr>
+                <w:rFonts w:asciiTheme="minorHAnsi" w:hAnsiTheme="minorHAnsi" w:cstheme="minorHAnsi"/>
+              </w:rPr>
+            </w:pPr>
+            <w:r>
+              <w:rPr>
+                <w:rFonts w:asciiTheme="minorHAnsi" w:hAnsiTheme="minorHAnsi" w:cstheme="minorHAnsi"/>
+              </w:rPr>
+              <w:t>Sertifikalı Firma</w:t>
+            </w:r>
+          </w:p>
+        </w:tc>
+      </w:tr>
+      <w:tr>
+        <w:tc>
+          <w:tcPr>
+            <w:tcW w:w="3591" w:type="dxa"/>
+          </w:tcPr>
+          <w:p>
+            <w:pPr>
+              <w:rPr>
+                <w:rFonts w:asciiTheme="minorHAnsi" w:hAnsiTheme="minorHAnsi" w:cstheme="minorHAnsi"/>
+              </w:rPr>
+            </w:pPr>
+            <w:r>
+              <w:rPr>
+                <w:rFonts w:asciiTheme="minorHAnsi" w:hAnsiTheme="minorHAnsi" w:cstheme="minorHAnsi"/>
+              </w:rPr>
+              <w:t>Adı Soyadı</w:t>
+            </w:r>
+          </w:p>
+        </w:tc>
+        <w:tc>
+          <w:tcPr>
+            <w:tcW w:w="3591" w:type="dxa"/>
+          </w:tcPr>
+          <w:p>
+            <w:pPr>
+              <w:rPr>
+                <w:rFonts w:asciiTheme="minorHAnsi" w:hAnsiTheme="minorHAnsi" w:cstheme="minorHAnsi"/>
+              </w:rPr>
+            </w:pPr>
+            <w:r>
+              <w:rPr>
+                <w:rFonts w:asciiTheme="minorHAnsi" w:hAnsiTheme="minorHAnsi" w:cstheme="minorHAnsi"/>
+              </w:rPr>
+              <w:t>Adı Soyadı</w:t>
+            </w:r>
+          </w:p>
+        </w:tc>
+        <w:tc>
+          <w:tcPr>
+            <w:tcW w:w="3591" w:type="dxa"/>
+          </w:tcPr>
+          <w:p>
+            <w:pPr>
+              <w:rPr>
+                <w:rFonts w:asciiTheme="minorHAnsi" w:hAnsiTheme="minorHAnsi" w:cstheme="minorHAnsi"/>
+              </w:rPr>
+            </w:pPr>
+            <w:r>
+              <w:rPr>
+                <w:rFonts w:asciiTheme="minorHAnsi" w:hAnsiTheme="minorHAnsi" w:cstheme="minorHAnsi"/>
+              </w:rPr>
+              <w:t>Firma / Yetkili</w:t>
+            </w:r>
+          </w:p>
+        </w:tc>
+      </w:tr>
+      <w:tr>
+        <w:tc>
+          <w:tcPr>
+            <w:tcW w:w="3591" w:type="dxa"/>
+          </w:tcPr>
+          <w:p>
+            <w:pPr>
+              <w:rPr>
+                <w:rFonts w:asciiTheme="minorHAnsi" w:hAnsiTheme="minorHAnsi" w:cstheme="minorHAnsi"/>
+              </w:rPr>
+            </w:pPr>
+            <w:r>
+              <w:rPr>
+                <w:rFonts w:asciiTheme="minorHAnsi" w:hAnsiTheme="minorHAnsi" w:cstheme="minorHAnsi"/>
+              </w:rPr>
+              <w:t>Tarih</w:t>
+            </w:r>
+          </w:p>
+        </w:tc>
+        <w:tc>
+          <w:tcPr>
+            <w:tcW w:w="3591" w:type="dxa"/>
+          </w:tcPr>
+          <w:p>
+            <w:pPr>
+              <w:rPr>
+                <w:rFonts w:asciiTheme="minorHAnsi" w:hAnsiTheme="minorHAnsi" w:cstheme="minorHAnsi"/>
+              </w:rPr>
+            </w:pPr>
+            <w:r>
+              <w:rPr>
+                <w:rFonts w:asciiTheme="minorHAnsi" w:hAnsiTheme="minorHAnsi" w:cstheme="minorHAnsi"/>
+              </w:rPr>
+              <w:t>Tarih</w:t>
+            </w:r>
+          </w:p>
+        </w:tc>
+        <w:tc>
+          <w:tcPr>
+            <w:tcW w:w="3591" w:type="dxa"/>
+          </w:tcPr>
+          <w:p>
+            <w:pPr>
+              <w:rPr>
+                <w:rFonts w:asciiTheme="minorHAnsi" w:hAnsiTheme="minorHAnsi" w:cstheme="minorHAnsi"/>
+              </w:rPr>
+            </w:pPr>
+            <w:r>
+              <w:rPr>
+                <w:rFonts w:asciiTheme="minorHAnsi" w:hAnsiTheme="minorHAnsi" w:cstheme="minorHAnsi"/>
+              </w:rPr>
+              <w:t>Tarih</w:t>
+            </w:r>
+          </w:p>
+        </w:tc>
+      </w:tr>
+      <w:tr>
+        <w:tc>
+          <w:tcPr>
+            <w:tcW w:w="3591" w:type="dxa"/>
+          </w:tcPr>
+          <w:p>
+            <w:pPr>
+              <w:rPr>
+                <w:rFonts w:asciiTheme="minorHAnsi" w:hAnsiTheme="minorHAnsi" w:cstheme="minorHAnsi"/>
+              </w:rPr>
+            </w:pPr>
+            <w:r>
+              <w:rPr>
+                <w:rFonts w:asciiTheme="minorHAnsi" w:hAnsiTheme="minorHAnsi" w:cstheme="minorHAnsi"/>
+              </w:rPr>
+              <w:t>İmza</w:t>
+            </w:r>
+          </w:p>
+        </w:tc>
+        <w:tc>
+          <w:tcPr>
+            <w:tcW w:w="3591" w:type="dxa"/>
+          </w:tcPr>
+          <w:p>
+            <w:pPr>
+              <w:rPr>
+                <w:rFonts w:asciiTheme="minorHAnsi" w:hAnsiTheme="minorHAnsi" w:cstheme="minorHAnsi"/>
+              </w:rPr>
+            </w:pPr>
+            <w:r>
+              <w:rPr>
+                <w:rFonts w:asciiTheme="minorHAnsi" w:hAnsiTheme="minorHAnsi" w:cstheme="minorHAnsi"/>
+              </w:rPr>
+              <w:t>İmza</w:t>
+            </w:r>
+          </w:p>
+        </w:tc>
+        <w:tc>
+          <w:tcPr>
+            <w:tcW w:w="3591" w:type="dxa"/>
+          </w:tcPr>
+          <w:p>
+            <w:pPr>
+              <w:rPr>
+                <w:rFonts w:asciiTheme="minorHAnsi" w:hAnsiTheme="minorHAnsi" w:cstheme="minorHAnsi"/>
+              </w:rPr>
+            </w:pPr>
+            <w:r>
+              <w:rPr>
+                <w:rFonts w:asciiTheme="minorHAnsi" w:hAnsiTheme="minorHAnsi" w:cstheme="minorHAnsi"/>
+              </w:rPr>
+              <w:t>Kaşe / İmza</w:t>
+            </w:r>
+          </w:p>
+        </w:tc>
+      </w:tr>
+    </w:tbl>
+    <w:p>
+      <w:pPr>
+        <w:rPr>
+          <w:rFonts w:asciiTheme="minorHAnsi" w:hAnsiTheme="minorHAnsi" w:cstheme="minorHAnsi"/>
+        </w:rPr>
+      </w:pPr>
+    </w:p>
+    <w:p>
+      <w:pPr>
+        <w:rPr>
+          <w:rFonts w:asciiTheme="minorHAnsi" w:hAnsiTheme="minorHAnsi" w:cstheme="minorHAnsi"/>
+        </w:rPr>
+      </w:pPr>
+      <w:r>
+        <w:rPr>
+          <w:rFonts w:asciiTheme="minorHAnsi" w:hAnsiTheme="minorHAnsi" w:cstheme="minorHAnsi"/>
+          <w:b/>
+        </w:rPr>
+        <w:t>4. KONTROL</w:t>
+      </w:r>
+    </w:p>
+    <w:p>
+      <w:pPr>
+        <w:rPr>
+          <w:rFonts w:asciiTheme="minorHAnsi" w:hAnsiTheme="minorHAnsi" w:cstheme="minorHAnsi"/>
+        </w:rPr>
+      </w:pPr>
+      <w:r>
+        <w:rPr>
+          <w:rFonts w:ascii="Segoe UI Symbol" w:hAnsi="Segoe UI Symbol" w:cs="Segoe UI Symbol"/>
+        </w:rPr>
+        <w:t>☐</w:t>
+      </w:r>
+      <w:r>
+        <w:rPr>
+          <w:rFonts w:asciiTheme="minorHAnsi" w:hAnsiTheme="minorHAnsi" w:cstheme="minorHAnsi"/>
+        </w:rPr>
+        <w:t xml:space="preserve"> Uygun      </w:t>
+      </w:r>
+      <w:r>
+        <w:rPr>
+          <w:rFonts w:ascii="Segoe UI Symbol" w:hAnsi="Segoe UI Symbol" w:cs="Segoe UI Symbol"/>
+        </w:rPr>
+        <w:t>☐</w:t>
+      </w:r>
+      <w:r>
+        <w:rPr>
+          <w:rFonts w:asciiTheme="minorHAnsi" w:hAnsiTheme="minorHAnsi" w:cstheme="minorHAnsi"/>
+        </w:rPr>
+        <w:t xml:space="preserve"> Uygun Değil</w:t>
+      </w:r>
+    </w:p>
+    <w:p>
+      <w:pPr>
+        <w:rPr>
+          <w:rFonts w:asciiTheme="minorHAnsi" w:hAnsiTheme="minorHAnsi" w:cstheme="minorHAnsi"/>
+        </w:rPr>
+      </w:pPr>
+      <w:r>
+        <w:rPr>
+          <w:rFonts w:asciiTheme="minorHAnsi" w:hAnsiTheme="minorHAnsi" w:cstheme="minorHAnsi"/>
+        </w:rPr>
+        <w:t>Uygun değil ise nedeni:</w:t>
+      </w:r>
+    </w:p>
+    <w:p>
+      <w:pPr>
+        <w:rPr>
+          <w:rFonts w:asciiTheme="minorHAnsi" w:hAnsiTheme="minorHAnsi" w:cstheme="minorHAnsi"/>
+        </w:rPr>
+      </w:pPr>
+      <w:r>
+        <w:rPr>
+          <w:rFonts w:asciiTheme="minorHAnsi" w:hAnsiTheme="minorHAnsi" w:cstheme="minorHAnsi"/>
+        </w:rPr>
+        <w:t>................................................................................</w:t>
+      </w:r>
+    </w:p>
+    <w:tbl>
+      <w:tblPr>
+        <w:tblStyle w:val="TabloKlavuzu"/>
+        <w:tblW w:w="0" w:type="auto"/>
+        <w:tblLook w:val="04A0" w:firstRow="1" w:lastRow="0" w:firstColumn="1" w:lastColumn="0" w:noHBand="0" w:noVBand="1"/>
+      </w:tblPr>
+      <w:tblGrid>
+        <w:gridCol w:w="3588"/>
+        <w:gridCol w:w="3587"/>
+        <w:gridCol w:w="3587"/>
+      </w:tblGrid>
+      <w:tr>
+        <w:tc>
+          <w:tcPr>
+            <w:tcW w:w="3591" w:type="dxa"/>
+          </w:tcPr>
+          <w:p>
+            <w:pPr>
+              <w:rPr>
+                <w:rFonts w:asciiTheme="minorHAnsi" w:hAnsiTheme="minorHAnsi" w:cstheme="minorHAnsi"/>
+              </w:rPr>
+            </w:pPr>
+            <w:r>
+              <w:rPr>
+                <w:rFonts w:asciiTheme="minorHAnsi" w:hAnsiTheme="minorHAnsi" w:cstheme="minorHAnsi"/>
+              </w:rPr>
+              <w:t>Gaz Dağıtım Şirketi Yetkilisi</w:t>
+            </w:r>
+          </w:p>
+        </w:tc>
+        <w:tc>
+          <w:tcPr>
+            <w:tcW w:w="3591" w:type="dxa"/>
+          </w:tcPr>
+          <w:p>
+            <w:pPr>
+              <w:rPr>
+                <w:rFonts w:asciiTheme="minorHAnsi" w:hAnsiTheme="minorHAnsi" w:cstheme="minorHAnsi"/>
+              </w:rPr>
+            </w:pPr>
+            <w:r>
+              <w:rPr>
+                <w:rFonts w:asciiTheme="minorHAnsi" w:hAnsiTheme="minorHAnsi" w:cstheme="minorHAnsi"/>
+              </w:rPr>
+              <w:t>Abone / Kullanıcı</w:t>
+            </w:r>
+          </w:p>
+        </w:tc>
+        <w:tc>
+          <w:tcPr>
+            <w:tcW w:w="3591" w:type="dxa"/>
+          </w:tcPr>
+          <w:p>
+            <w:pPr>
+              <w:rPr>
+                <w:rFonts w:asciiTheme="minorHAnsi" w:hAnsiTheme="minorHAnsi" w:cstheme="minorHAnsi"/>
+              </w:rPr>
+            </w:pPr>
+            <w:r>
+              <w:rPr>
+                <w:rFonts w:asciiTheme="minorHAnsi" w:hAnsiTheme="minorHAnsi" w:cstheme="minorHAnsi"/>
+              </w:rPr>
+              <w:t>Sertifikalı Firma</w:t>
+            </w:r>
+          </w:p>
+        </w:tc>
+      </w:tr>
+      <w:tr>
+        <w:tc>
+          <w:tcPr>
+            <w:tcW w:w="3591" w:type="dxa"/>
+          </w:tcPr>
+          <w:p>
+            <w:pPr>
+              <w:rPr>
+                <w:rFonts w:asciiTheme="minorHAnsi" w:hAnsiTheme="minorHAnsi" w:cstheme="minorHAnsi"/>
+              </w:rPr>
+            </w:pPr>
+            <w:r>
+              <w:rPr>
+                <w:rFonts w:asciiTheme="minorHAnsi" w:hAnsiTheme="minorHAnsi" w:cstheme="minorHAnsi"/>
+              </w:rPr>
+              <w:t>Adı Soyadı</w:t>
+            </w:r>
+          </w:p>
+        </w:tc>
+        <w:tc>
+          <w:tcPr>
+            <w:tcW w:w="3591" w:type="dxa"/>
+          </w:tcPr>
+          <w:p>
+            <w:pPr>
+              <w:rPr>
+                <w:rFonts w:asciiTheme="minorHAnsi" w:hAnsiTheme="minorHAnsi" w:cstheme="minorHAnsi"/>
+              </w:rPr>
+            </w:pPr>
+            <w:r>
+              <w:rPr>
+                <w:rFonts w:asciiTheme="minorHAnsi" w:hAnsiTheme="minorHAnsi" w:cstheme="minorHAnsi"/>
+              </w:rPr>
+              <w:t>Adı Soyadı</w:t>
+            </w:r>
+          </w:p>
+        </w:tc>
+        <w:tc>
+          <w:tcPr>
+            <w:tcW w:w="3591" w:type="dxa"/>
+          </w:tcPr>
+          <w:p>
+            <w:pPr>
+              <w:rPr>
+                <w:rFonts w:asciiTheme="minorHAnsi" w:hAnsiTheme="minorHAnsi" w:cstheme="minorHAnsi"/>
+              </w:rPr>
+            </w:pPr>
+            <w:r>
+              <w:rPr>
+                <w:rFonts w:asciiTheme="minorHAnsi" w:hAnsiTheme="minorHAnsi" w:cstheme="minorHAnsi"/>
+              </w:rPr>
+              <w:t>Firma / Yetkili</w:t>
+            </w:r>
+          </w:p>
+        </w:tc>
+      </w:tr>
+      <w:tr>
+        <w:tc>
+          <w:tcPr>
+            <w:tcW w:w="3591" w:type="dxa"/>
+          </w:tcPr>
+          <w:p>
+            <w:pPr>
+              <w:rPr>
+                <w:rFonts w:asciiTheme="minorHAnsi" w:hAnsiTheme="minorHAnsi" w:cstheme="minorHAnsi"/>
+              </w:rPr>
+            </w:pPr>
+            <w:r>
+              <w:rPr>
+                <w:rFonts w:asciiTheme="minorHAnsi" w:hAnsiTheme="minorHAnsi" w:cstheme="minorHAnsi"/>
+              </w:rPr>
+              <w:t>Tarih</w:t>
+            </w:r>
+          </w:p>
+        </w:tc>
+        <w:tc>
+          <w:tcPr>
+            <w:tcW w:w="3591" w:type="dxa"/>
+          </w:tcPr>
+          <w:p>
+            <w:pPr>
+              <w:rPr>
+                <w:rFonts w:asciiTheme="minorHAnsi" w:hAnsiTheme="minorHAnsi" w:cstheme="minorHAnsi"/>
+              </w:rPr>
+            </w:pPr>
+            <w:r>
+              <w:rPr>
+                <w:rFonts w:asciiTheme="minorHAnsi" w:hAnsiTheme="minorHAnsi" w:cstheme="minorHAnsi"/>
+              </w:rPr>
+              <w:t>Tarih</w:t>
+            </w:r>
+          </w:p>
+        </w:tc>
+        <w:tc>
+          <w:tcPr>
+            <w:tcW w:w="3591" w:type="dxa"/>
+          </w:tcPr>
+          <w:p>
+            <w:pPr>
+              <w:rPr>
+                <w:rFonts w:asciiTheme="minorHAnsi" w:hAnsiTheme="minorHAnsi" w:cstheme="minorHAnsi"/>
+              </w:rPr>
+            </w:pPr>
+            <w:r>
+              <w:rPr>
+                <w:rFonts w:asciiTheme="minorHAnsi" w:hAnsiTheme="minorHAnsi" w:cstheme="minorHAnsi"/>
+              </w:rPr>
+              <w:t>Tarih</w:t>
+            </w:r>
+          </w:p>
+        </w:tc>
+      </w:tr>
+      <w:tr>
+        <w:tc>
+          <w:tcPr>
+            <w:tcW w:w="3591" w:type="dxa"/>
+          </w:tcPr>
+          <w:p>
+            <w:pPr>
+              <w:rPr>
+                <w:rFonts w:asciiTheme="minorHAnsi" w:hAnsiTheme="minorHAnsi" w:cstheme="minorHAnsi"/>
+              </w:rPr>
+            </w:pPr>
+            <w:r>
+              <w:rPr>
+                <w:rFonts w:asciiTheme="minorHAnsi" w:hAnsiTheme="minorHAnsi" w:cstheme="minorHAnsi"/>
+              </w:rPr>
+              <w:t>İmza</w:t>
+            </w:r>
+          </w:p>
+        </w:tc>
+        <w:tc>
+          <w:tcPr>
+            <w:tcW w:w="3591" w:type="dxa"/>
+          </w:tcPr>
+          <w:p>
+            <w:pPr>
+              <w:rPr>
+                <w:rFonts w:asciiTheme="minorHAnsi" w:hAnsiTheme="minorHAnsi" w:cstheme="minorHAnsi"/>
+              </w:rPr>
+            </w:pPr>
+            <w:r>
+              <w:rPr>
+                <w:rFonts w:asciiTheme="minorHAnsi" w:hAnsiTheme="minorHAnsi" w:cstheme="minorHAnsi"/>
+              </w:rPr>
+              <w:t>İmza</w:t>
+            </w:r>
+          </w:p>
+        </w:tc>
+        <w:tc>
+          <w:tcPr>
+            <w:tcW w:w="3591" w:type="dxa"/>
+          </w:tcPr>
+          <w:p>
+            <w:pPr>
+              <w:rPr>
+                <w:rFonts w:asciiTheme="minorHAnsi" w:hAnsiTheme="minorHAnsi" w:cstheme="minorHAnsi"/>
+              </w:rPr>
+            </w:pPr>
+            <w:r>
+              <w:rPr>
+                <w:rFonts w:asciiTheme="minorHAnsi" w:hAnsiTheme="minorHAnsi" w:cstheme="minorHAnsi"/>
+              </w:rPr>
+              <w:t>Kaşe / İmza</w:t>
+            </w:r>
+          </w:p>
+        </w:tc>
+      </w:tr>
+    </w:tbl>
+    <w:p>
+      <w:pPr>
+        <w:rPr>
+          <w:rFonts w:asciiTheme="minorHAnsi" w:hAnsiTheme="minorHAnsi" w:cstheme="minorHAnsi"/>
+        </w:rPr>
+      </w:pPr>
+    </w:p>
+    <w:p>
+      <w:pPr>
+        <w:rPr>
+          <w:rFonts w:asciiTheme="minorHAnsi" w:hAnsiTheme="minorHAnsi" w:cstheme="minorHAnsi"/>
+        </w:rPr>
+      </w:pPr>
+      <w:r>
+        <w:rPr>
+          <w:rFonts w:asciiTheme="minorHAnsi" w:hAnsiTheme="minorHAnsi" w:cstheme="minorHAnsi"/>
+          <w:b/>
+        </w:rPr>
+        <w:t>5. KONTROL</w:t>
+      </w:r>
+    </w:p>
+    <w:p>
+      <w:pPr>
+        <w:rPr>
+          <w:rFonts w:asciiTheme="minorHAnsi" w:hAnsiTheme="minorHAnsi" w:cstheme="minorHAnsi"/>
+        </w:rPr>
+      </w:pPr>
+      <w:r>
+        <w:rPr>
+          <w:rFonts w:ascii="Segoe UI Symbol" w:hAnsi="Segoe UI Symbol" w:cs="Segoe UI Symbol"/>
+        </w:rPr>
+        <w:t>☐</w:t>
+      </w:r>
+      <w:r>
+        <w:rPr>
+          <w:rFonts w:asciiTheme="minorHAnsi" w:hAnsiTheme="minorHAnsi" w:cstheme="minorHAnsi"/>
+        </w:rPr>
+        <w:t xml:space="preserve"> Uygun      </w:t>
+      </w:r>
+      <w:r>
+        <w:rPr>
+          <w:rFonts w:ascii="Segoe UI Symbol" w:hAnsi="Segoe UI Symbol" w:cs="Segoe UI Symbol"/>
+        </w:rPr>
+        <w:t>☐</w:t>
+      </w:r>
+      <w:r>
+        <w:rPr>
+          <w:rFonts w:asciiTheme="minorHAnsi" w:hAnsiTheme="minorHAnsi" w:cstheme="minorHAnsi"/>
+        </w:rPr>
+        <w:t xml:space="preserve"> Uygun Değil</w:t>
+      </w:r>
+    </w:p>
+    <w:p>
+      <w:pPr>
+        <w:rPr>
+          <w:rFonts w:asciiTheme="minorHAnsi" w:hAnsiTheme="minorHAnsi" w:cstheme="minorHAnsi"/>
+        </w:rPr>
+      </w:pPr>
+      <w:r>
+        <w:rPr>
+          <w:rFonts w:asciiTheme="minorHAnsi" w:hAnsiTheme="minorHAnsi" w:cstheme="minorHAnsi"/>
+        </w:rPr>
+        <w:t>Uygun değil ise nedeni:</w:t>
+      </w:r>
+    </w:p>
+    <w:p>
+      <w:pPr>
+        <w:rPr>
+          <w:rFonts w:asciiTheme="minorHAnsi" w:hAnsiTheme="minorHAnsi" w:cstheme="minorHAnsi"/>
+        </w:rPr>
+      </w:pPr>
+      <w:r>
+        <w:rPr>
+          <w:rFonts w:asciiTheme="minorHAnsi" w:hAnsiTheme="minorHAnsi" w:cstheme="minorHAnsi"/>
+        </w:rPr>
+        <w:t>................................................................................</w:t>
+      </w:r>
+    </w:p>
+    <w:tbl>
+      <w:tblPr>
+        <w:tblStyle w:val="TabloKlavuzu"/>
+        <w:tblW w:w="0" w:type="auto"/>
+        <w:tblLook w:val="04A0" w:firstRow="1" w:lastRow="0" w:firstColumn="1" w:lastColumn="0" w:noHBand="0" w:noVBand="1"/>
+      </w:tblPr>
+      <w:tblGrid>
+        <w:gridCol w:w="3588"/>
+        <w:gridCol w:w="3587"/>
+        <w:gridCol w:w="3587"/>
+      </w:tblGrid>
+      <w:tr>
+        <w:tc>
+          <w:tcPr>
+            <w:tcW w:w="3591" w:type="dxa"/>
+          </w:tcPr>
+          <w:p>
+            <w:pPr>
+              <w:rPr>
+                <w:rFonts w:asciiTheme="minorHAnsi" w:hAnsiTheme="minorHAnsi" w:cstheme="minorHAnsi"/>
+              </w:rPr>
+            </w:pPr>
+            <w:r>
+              <w:rPr>
+                <w:rFonts w:asciiTheme="minorHAnsi" w:hAnsiTheme="minorHAnsi" w:cstheme="minorHAnsi"/>
+              </w:rPr>
+              <w:t>Gaz Dağıtım Şirketi Yetkilisi</w:t>
+            </w:r>
+          </w:p>
+        </w:tc>
+        <w:tc>
+          <w:tcPr>
+            <w:tcW w:w="3591" w:type="dxa"/>
+          </w:tcPr>
+          <w:p>
+            <w:pPr>
+              <w:rPr>
+                <w:rFonts w:asciiTheme="minorHAnsi" w:hAnsiTheme="minorHAnsi" w:cstheme="minorHAnsi"/>
+              </w:rPr>
+            </w:pPr>
+            <w:r>
+              <w:rPr>
+                <w:rFonts w:asciiTheme="minorHAnsi" w:hAnsiTheme="minorHAnsi" w:cstheme="minorHAnsi"/>
+              </w:rPr>
+              <w:t>Abone / Kullanıcı</w:t>
+            </w:r>
+          </w:p>
+        </w:tc>
+        <w:tc>
+          <w:tcPr>
+            <w:tcW w:w="3591" w:type="dxa"/>
+          </w:tcPr>
+          <w:p>
+            <w:pPr>
+              <w:rPr>
+                <w:rFonts w:asciiTheme="minorHAnsi" w:hAnsiTheme="minorHAnsi" w:cstheme="minorHAnsi"/>
+              </w:rPr>
+            </w:pPr>
+            <w:r>
+              <w:rPr>
+                <w:rFonts w:asciiTheme="minorHAnsi" w:hAnsiTheme="minorHAnsi" w:cstheme="minorHAnsi"/>
+              </w:rPr>
+              <w:t>Sertifikalı Firma</w:t>
+            </w:r>
+          </w:p>
+        </w:tc>
+      </w:tr>
+      <w:tr>
+        <w:tc>
+          <w:tcPr>
+            <w:tcW w:w="3591" w:type="dxa"/>
+          </w:tcPr>
+          <w:p>
+            <w:pPr>
+              <w:rPr>
+                <w:rFonts w:asciiTheme="minorHAnsi" w:hAnsiTheme="minorHAnsi" w:cstheme="minorHAnsi"/>
+              </w:rPr>
+            </w:pPr>
+            <w:r>
+              <w:rPr>
+                <w:rFonts w:asciiTheme="minorHAnsi" w:hAnsiTheme="minorHAnsi" w:cstheme="minorHAnsi"/>
+              </w:rPr>
+              <w:t>Adı Soyadı</w:t>
+            </w:r>
+          </w:p>
+        </w:tc>
+        <w:tc>
+          <w:tcPr>
+            <w:tcW w:w="3591" w:type="dxa"/>
+          </w:tcPr>
+          <w:p>
+            <w:pPr>
+              <w:rPr>
+                <w:rFonts w:asciiTheme="minorHAnsi" w:hAnsiTheme="minorHAnsi" w:cstheme="minorHAnsi"/>
+              </w:rPr>
+            </w:pPr>
+            <w:r>
+              <w:rPr>
+                <w:rFonts w:asciiTheme="minorHAnsi" w:hAnsiTheme="minorHAnsi" w:cstheme="minorHAnsi"/>
+              </w:rPr>
+              <w:t>Adı Soyadı</w:t>
+            </w:r>
+          </w:p>
+        </w:tc>
+        <w:tc>
+          <w:tcPr>
+            <w:tcW w:w="3591" w:type="dxa"/>
+          </w:tcPr>
+          <w:p>
+            <w:pPr>
+              <w:rPr>
+                <w:rFonts w:asciiTheme="minorHAnsi" w:hAnsiTheme="minorHAnsi" w:cstheme="minorHAnsi"/>
+              </w:rPr>
+            </w:pPr>
+            <w:r>
+              <w:rPr>
+                <w:rFonts w:asciiTheme="minorHAnsi" w:hAnsiTheme="minorHAnsi" w:cstheme="minorHAnsi"/>
+              </w:rPr>
+              <w:t>Firma / Yetkili</w:t>
+            </w:r>
+          </w:p>
+        </w:tc>
+      </w:tr>
+      <w:tr>
+        <w:tc>
+          <w:tcPr>
+            <w:tcW w:w="3591" w:type="dxa"/>
+          </w:tcPr>
+          <w:p>
+            <w:pPr>
+              <w:rPr>
+                <w:rFonts w:asciiTheme="minorHAnsi" w:hAnsiTheme="minorHAnsi" w:cstheme="minorHAnsi"/>
+              </w:rPr>
+            </w:pPr>
+            <w:r>
+              <w:rPr>
+                <w:rFonts w:asciiTheme="minorHAnsi" w:hAnsiTheme="minorHAnsi" w:cstheme="minorHAnsi"/>
+              </w:rPr>
+              <w:t>Tarih</w:t>
+            </w:r>
+          </w:p>
+        </w:tc>
+        <w:tc>
+          <w:tcPr>
+            <w:tcW w:w="3591" w:type="dxa"/>
+          </w:tcPr>
+          <w:p>
+            <w:pPr>
+              <w:rPr>
+                <w:rFonts w:asciiTheme="minorHAnsi" w:hAnsiTheme="minorHAnsi" w:cstheme="minorHAnsi"/>
+              </w:rPr>
+            </w:pPr>
+            <w:r>
+              <w:rPr>
+                <w:rFonts w:asciiTheme="minorHAnsi" w:hAnsiTheme="minorHAnsi" w:cstheme="minorHAnsi"/>
+              </w:rPr>
+              <w:t>Tarih</w:t>
+            </w:r>
+          </w:p>
+        </w:tc>
+        <w:tc>
+          <w:tcPr>
+            <w:tcW w:w="3591" w:type="dxa"/>
+          </w:tcPr>
+          <w:p>
+            <w:pPr>
+              <w:rPr>
+                <w:rFonts w:asciiTheme="minorHAnsi" w:hAnsiTheme="minorHAnsi" w:cstheme="minorHAnsi"/>
+              </w:rPr>
+            </w:pPr>
+            <w:r>
+              <w:rPr>
+                <w:rFonts w:asciiTheme="minorHAnsi" w:hAnsiTheme="minorHAnsi" w:cstheme="minorHAnsi"/>
+              </w:rPr>
+              <w:t>Tarih</w:t>
+            </w:r>
+          </w:p>
+        </w:tc>
+      </w:tr>
+      <w:tr>
+        <w:tc>
+          <w:tcPr>
+            <w:tcW w:w="3591" w:type="dxa"/>
+          </w:tcPr>
+          <w:p>
+            <w:pPr>
+              <w:rPr>
+                <w:rFonts w:asciiTheme="minorHAnsi" w:hAnsiTheme="minorHAnsi" w:cstheme="minorHAnsi"/>
+              </w:rPr>
+            </w:pPr>
+            <w:r>
+              <w:rPr>
+                <w:rFonts w:asciiTheme="minorHAnsi" w:hAnsiTheme="minorHAnsi" w:cstheme="minorHAnsi"/>
+              </w:rPr>
+              <w:t>İmza</w:t>
+            </w:r>
+          </w:p>
+        </w:tc>
+        <w:tc>
+          <w:tcPr>
+            <w:tcW w:w="3591" w:type="dxa"/>
+          </w:tcPr>
+          <w:p>
+            <w:pPr>
+              <w:rPr>
+                <w:rFonts w:asciiTheme="minorHAnsi" w:hAnsiTheme="minorHAnsi" w:cstheme="minorHAnsi"/>
+              </w:rPr>
+            </w:pPr>
+            <w:r>
+              <w:rPr>
+                <w:rFonts w:asciiTheme="minorHAnsi" w:hAnsiTheme="minorHAnsi" w:cstheme="minorHAnsi"/>
+              </w:rPr>
+              <w:t>İmza</w:t>
+            </w:r>
+          </w:p>
+        </w:tc>
+        <w:tc>
+          <w:tcPr>
+            <w:tcW w:w="3591" w:type="dxa"/>
+          </w:tcPr>
+          <w:p>
+            <w:pPr>
+              <w:rPr>
+                <w:rFonts w:asciiTheme="minorHAnsi" w:hAnsiTheme="minorHAnsi" w:cstheme="minorHAnsi"/>
+              </w:rPr>
+            </w:pPr>
+            <w:r>
+              <w:rPr>
+                <w:rFonts w:asciiTheme="minorHAnsi" w:hAnsiTheme="minorHAnsi" w:cstheme="minorHAnsi"/>
+              </w:rPr>
+              <w:t>Kaşe / İmza</w:t>
+            </w:r>
+          </w:p>
+        </w:tc>
+      </w:tr>
+    </w:tbl>
+    <w:p>
+      <w:pPr>
+        <w:rPr>
+          <w:rFonts w:asciiTheme="minorHAnsi" w:hAnsiTheme="minorHAnsi" w:cstheme="minorHAnsi"/>
+        </w:rPr>
+      </w:pPr>
+    </w:p>
     <w:sectPr>
-      <w:headerReference w:type="default" r:id="rId7"/>
-      <w:footerReference w:type="even" r:id="rId8"/>
-      <w:footerReference w:type="default" r:id="rId9"/>
+      <w:headerReference w:type="even" r:id="rId7"/>
+      <w:headerReference w:type="default" r:id="rId8"/>
+      <w:footerReference w:type="even" r:id="rId9"/>
+      <w:footerReference w:type="default" r:id="rId10"/>
+      <w:headerReference w:type="first" r:id="rId11"/>
+      <w:footerReference w:type="first" r:id="rId12"/>
       <w:pgSz w:w="11906" w:h="16838"/>
       <w:pgMar w:top="567" w:right="567" w:bottom="567" w:left="567" w:header="567" w:footer="0" w:gutter="0"/>
       <w:pgNumType w:start="1" w:chapStyle="1"/>
@@ -1609,7 +3367,7 @@
 </file>
 
 <file path=word/endnotes.xml><?xml version="1.0" encoding="utf-8"?>
-<w:endnotes xmlns:wpc="http://schemas.microsoft.com/office/word/2010/wordprocessingCanvas" xmlns:cx="http://schemas.microsoft.com/office/drawing/2014/chartex" xmlns:cx1="http://schemas.microsoft.com/office/drawing/2015/9/8/chartex" xmlns:cx2="http://schemas.microsoft.com/office/drawing/2015/10/21/chartex" xmlns:cx3="http://schemas.microsoft.com/office/drawing/2016/5/9/chartex" xmlns:cx4="http://schemas.microsoft.com/office/drawing/2016/5/10/chartex" xmlns:cx5="http://schemas.microsoft.com/office/drawing/2016/5/11/chartex" xmlns:cx6="http://schemas.microsoft.com/office/drawing/2016/5/12/chartex" xmlns:cx7="http://schemas.microsoft.com/office/drawing/2016/5/13/chartex" xmlns:cx8="http://schemas.microsoft.com/office/drawing/2016/5/14/chartex" xmlns:mc="http://schemas.openxmlformats.org/markup-compatibility/2006" xmlns:aink="http://schemas.microsoft.com/office/drawing/2016/ink" xmlns:am3d="http://schemas.microsoft.com/office/drawing/2017/model3d" xmlns:o="urn:schemas-microsoft-com:office:office" xmlns:oel="http://schemas.microsoft.com/office/2019/extlst" xmlns:r="http://schemas.openxmlformats.org/officeDocument/2006/relationships" xmlns:m="http://schemas.openxmlformats.org/officeDocument/2006/math" xmlns:v="urn:schemas-microsoft-com:vml" xmlns:wp14="http://schemas.microsoft.com/office/word/2010/wordprocessingDrawing" xmlns:wp="http://schemas.openxmlformats.org/drawingml/2006/wordprocessingDrawing" xmlns:w10="urn:schemas-microsoft-com:office:word" xmlns:w="http://schemas.openxmlformats.org/wordprocessingml/2006/main" xmlns:w14="http://schemas.microsoft.com/office/word/2010/wordml" xmlns:w15="http://schemas.microsoft.com/office/word/2012/wordml" xmlns:w16cex="http://schemas.microsoft.com/office/word/2018/wordml/cex" xmlns:w16cid="http://schemas.microsoft.com/office/word/2016/wordml/cid" xmlns:w16="http://schemas.microsoft.com/office/word/2018/wordml" xmlns:w16sdtdh="http://schemas.microsoft.com/office/word/2020/wordml/sdtdatahash" xmlns:w16se="http://schemas.microsoft.com/office/word/2015/wordml/symex" xmlns:wpg="http://schemas.microsoft.com/office/word/2010/wordprocessingGroup" xmlns:wpi="http://schemas.microsoft.com/office/word/2010/wordprocessingInk" xmlns:wne="http://schemas.microsoft.com/office/word/2006/wordml" xmlns:wps="http://schemas.microsoft.com/office/word/2010/wordprocessingShape" mc:Ignorable="w14 w15 w16se w16cid w16 w16cex w16sdtdh wp14">
+<w:endnotes xmlns:wpc="http://schemas.microsoft.com/office/word/2010/wordprocessingCanvas" xmlns:cx="http://schemas.microsoft.com/office/drawing/2014/chartex" xmlns:cx1="http://schemas.microsoft.com/office/drawing/2015/9/8/chartex" xmlns:cx2="http://schemas.microsoft.com/office/drawing/2015/10/21/chartex" xmlns:cx3="http://schemas.microsoft.com/office/drawing/2016/5/9/chartex" xmlns:cx4="http://schemas.microsoft.com/office/drawing/2016/5/10/chartex" xmlns:cx5="http://schemas.microsoft.com/office/drawing/2016/5/11/chartex" xmlns:cx6="http://schemas.microsoft.com/office/drawing/2016/5/12/chartex" xmlns:cx7="http://schemas.microsoft.com/office/drawing/2016/5/13/chartex" xmlns:cx8="http://schemas.microsoft.com/office/drawing/2016/5/14/chartex" xmlns:mc="http://schemas.openxmlformats.org/markup-compatibility/2006" xmlns:aink="http://schemas.microsoft.com/office/drawing/2016/ink" xmlns:am3d="http://schemas.microsoft.com/office/drawing/2017/model3d" xmlns:o="urn:schemas-microsoft-com:office:office" xmlns:oel="http://schemas.microsoft.com/office/2019/extlst" xmlns:r="http://schemas.openxmlformats.org/officeDocument/2006/relationships" xmlns:m="http://schemas.openxmlformats.org/officeDocument/2006/math" xmlns:v="urn:schemas-microsoft-com:vml" xmlns:wp14="http://schemas.microsoft.com/office/word/2010/wordprocessingDrawing" xmlns:wp="http://schemas.openxmlformats.org/drawingml/2006/wordprocessingDrawing" xmlns:w10="urn:schemas-microsoft-com:office:word" xmlns:w="http://schemas.openxmlformats.org/wordprocessingml/2006/main" xmlns:w14="http://schemas.microsoft.com/office/word/2010/wordml" xmlns:w15="http://schemas.microsoft.com/office/word/2012/wordml" xmlns:w16cei="http://schemas.microsoft.com/office/word/2026/wordml/cei" xmlns:w16cex="http://schemas.microsoft.com/office/word/2018/wordml/cex" xmlns:w16cid="http://schemas.microsoft.com/office/word/2016/wordml/cid" xmlns:w16="http://schemas.microsoft.com/office/word/2018/wordml" xmlns:w16du="http://schemas.microsoft.com/office/word/2023/wordml/word16du" xmlns:w16sdtdh="http://schemas.microsoft.com/office/word/2020/wordml/sdtdatahash" xmlns:w16sdtfl="http://schemas.microsoft.com/office/word/2024/wordml/sdtformatlock" xmlns:w16se="http://schemas.microsoft.com/office/word/2015/wordml/symex" xmlns:wpg="http://schemas.microsoft.com/office/word/2010/wordprocessingGroup" xmlns:wpi="http://schemas.microsoft.com/office/word/2010/wordprocessingInk" xmlns:wne="http://schemas.microsoft.com/office/word/2006/wordml" xmlns:wps="http://schemas.microsoft.com/office/word/2010/wordprocessingShape" mc:Ignorable="w14 w15 w16se w16cid w16 w16cex w16sdtdh w16sdtfl w16du wp14">
   <w:endnote w:type="separator" w:id="-1">
     <w:p>
       <w:r>
@@ -1628,7 +3386,7 @@
 </file>
 
 <file path=word/footer1.xml><?xml version="1.0" encoding="utf-8"?>
-<w:ftr xmlns:wpc="http://schemas.microsoft.com/office/word/2010/wordprocessingCanvas" xmlns:cx="http://schemas.microsoft.com/office/drawing/2014/chartex" xmlns:cx1="http://schemas.microsoft.com/office/drawing/2015/9/8/chartex" xmlns:cx2="http://schemas.microsoft.com/office/drawing/2015/10/21/chartex" xmlns:cx3="http://schemas.microsoft.com/office/drawing/2016/5/9/chartex" xmlns:cx4="http://schemas.microsoft.com/office/drawing/2016/5/10/chartex" xmlns:cx5="http://schemas.microsoft.com/office/drawing/2016/5/11/chartex" xmlns:cx6="http://schemas.microsoft.com/office/drawing/2016/5/12/chartex" xmlns:cx7="http://schemas.microsoft.com/office/drawing/2016/5/13/chartex" xmlns:cx8="http://schemas.microsoft.com/office/drawing/2016/5/14/chartex" xmlns:mc="http://schemas.openxmlformats.org/markup-compatibility/2006" xmlns:aink="http://schemas.microsoft.com/office/drawing/2016/ink" xmlns:am3d="http://schemas.microsoft.com/office/drawing/2017/model3d" xmlns:o="urn:schemas-microsoft-com:office:office" xmlns:oel="http://schemas.microsoft.com/office/2019/extlst" xmlns:r="http://schemas.openxmlformats.org/officeDocument/2006/relationships" xmlns:m="http://schemas.openxmlformats.org/officeDocument/2006/math" xmlns:v="urn:schemas-microsoft-com:vml" xmlns:wp14="http://schemas.microsoft.com/office/word/2010/wordprocessingDrawing" xmlns:wp="http://schemas.openxmlformats.org/drawingml/2006/wordprocessingDrawing" xmlns:w10="urn:schemas-microsoft-com:office:word" xmlns:w="http://schemas.openxmlformats.org/wordprocessingml/2006/main" xmlns:w14="http://schemas.microsoft.com/office/word/2010/wordml" xmlns:w15="http://schemas.microsoft.com/office/word/2012/wordml" xmlns:w16cex="http://schemas.microsoft.com/office/word/2018/wordml/cex" xmlns:w16cid="http://schemas.microsoft.com/office/word/2016/wordml/cid" xmlns:w16="http://schemas.microsoft.com/office/word/2018/wordml" xmlns:w16sdtdh="http://schemas.microsoft.com/office/word/2020/wordml/sdtdatahash" xmlns:w16se="http://schemas.microsoft.com/office/word/2015/wordml/symex" xmlns:wpg="http://schemas.microsoft.com/office/word/2010/wordprocessingGroup" xmlns:wpi="http://schemas.microsoft.com/office/word/2010/wordprocessingInk" xmlns:wne="http://schemas.microsoft.com/office/word/2006/wordml" xmlns:wps="http://schemas.microsoft.com/office/word/2010/wordprocessingShape" mc:Ignorable="w14 w15 w16se w16cid w16 w16cex w16sdtdh wp14">
+<w:ftr xmlns:wpc="http://schemas.microsoft.com/office/word/2010/wordprocessingCanvas" xmlns:cx="http://schemas.microsoft.com/office/drawing/2014/chartex" xmlns:cx1="http://schemas.microsoft.com/office/drawing/2015/9/8/chartex" xmlns:cx2="http://schemas.microsoft.com/office/drawing/2015/10/21/chartex" xmlns:cx3="http://schemas.microsoft.com/office/drawing/2016/5/9/chartex" xmlns:cx4="http://schemas.microsoft.com/office/drawing/2016/5/10/chartex" xmlns:cx5="http://schemas.microsoft.com/office/drawing/2016/5/11/chartex" xmlns:cx6="http://schemas.microsoft.com/office/drawing/2016/5/12/chartex" xmlns:cx7="http://schemas.microsoft.com/office/drawing/2016/5/13/chartex" xmlns:cx8="http://schemas.microsoft.com/office/drawing/2016/5/14/chartex" xmlns:mc="http://schemas.openxmlformats.org/markup-compatibility/2006" xmlns:aink="http://schemas.microsoft.com/office/drawing/2016/ink" xmlns:am3d="http://schemas.microsoft.com/office/drawing/2017/model3d" xmlns:o="urn:schemas-microsoft-com:office:office" xmlns:oel="http://schemas.microsoft.com/office/2019/extlst" xmlns:r="http://schemas.openxmlformats.org/officeDocument/2006/relationships" xmlns:m="http://schemas.openxmlformats.org/officeDocument/2006/math" xmlns:v="urn:schemas-microsoft-com:vml" xmlns:wp14="http://schemas.microsoft.com/office/word/2010/wordprocessingDrawing" xmlns:wp="http://schemas.openxmlformats.org/drawingml/2006/wordprocessingDrawing" xmlns:w10="urn:schemas-microsoft-com:office:word" xmlns:w="http://schemas.openxmlformats.org/wordprocessingml/2006/main" xmlns:w14="http://schemas.microsoft.com/office/word/2010/wordml" xmlns:w15="http://schemas.microsoft.com/office/word/2012/wordml" xmlns:w16cei="http://schemas.microsoft.com/office/word/2026/wordml/cei" xmlns:w16cex="http://schemas.microsoft.com/office/word/2018/wordml/cex" xmlns:w16cid="http://schemas.microsoft.com/office/word/2016/wordml/cid" xmlns:w16="http://schemas.microsoft.com/office/word/2018/wordml" xmlns:w16du="http://schemas.microsoft.com/office/word/2023/wordml/word16du" xmlns:w16sdtdh="http://schemas.microsoft.com/office/word/2020/wordml/sdtdatahash" xmlns:w16sdtfl="http://schemas.microsoft.com/office/word/2024/wordml/sdtformatlock" xmlns:w16se="http://schemas.microsoft.com/office/word/2015/wordml/symex" xmlns:wpg="http://schemas.microsoft.com/office/word/2010/wordprocessingGroup" xmlns:wpi="http://schemas.microsoft.com/office/word/2010/wordprocessingInk" xmlns:wne="http://schemas.microsoft.com/office/word/2006/wordml" xmlns:wps="http://schemas.microsoft.com/office/word/2010/wordprocessingShape" mc:Ignorable="w14 w15 w16se w16cid w16 w16cex w16sdtdh w16sdtfl w16du wp14">
   <w:p>
     <w:pPr>
       <w:pStyle w:val="AltBilgi"/>
@@ -1666,37 +3424,69 @@
 </file>
 
 <file path=word/footer2.xml><?xml version="1.0" encoding="utf-8"?>
-<w:ftr xmlns:wpc="http://schemas.microsoft.com/office/word/2010/wordprocessingCanvas" xmlns:cx="http://schemas.microsoft.com/office/drawing/2014/chartex" xmlns:cx1="http://schemas.microsoft.com/office/drawing/2015/9/8/chartex" xmlns:cx2="http://schemas.microsoft.com/office/drawing/2015/10/21/chartex" xmlns:cx3="http://schemas.microsoft.com/office/drawing/2016/5/9/chartex" xmlns:cx4="http://schemas.microsoft.com/office/drawing/2016/5/10/chartex" xmlns:cx5="http://schemas.microsoft.com/office/drawing/2016/5/11/chartex" xmlns:cx6="http://schemas.microsoft.com/office/drawing/2016/5/12/chartex" xmlns:cx7="http://schemas.microsoft.com/office/drawing/2016/5/13/chartex" xmlns:cx8="http://schemas.microsoft.com/office/drawing/2016/5/14/chartex" xmlns:mc="http://schemas.openxmlformats.org/markup-compatibility/2006" xmlns:aink="http://schemas.microsoft.com/office/drawing/2016/ink" xmlns:am3d="http://schemas.microsoft.com/office/drawing/2017/model3d" xmlns:o="urn:schemas-microsoft-com:office:office" xmlns:oel="http://schemas.microsoft.com/office/2019/extlst" xmlns:r="http://schemas.openxmlformats.org/officeDocument/2006/relationships" xmlns:m="http://schemas.openxmlformats.org/officeDocument/2006/math" xmlns:v="urn:schemas-microsoft-com:vml" xmlns:wp14="http://schemas.microsoft.com/office/word/2010/wordprocessingDrawing" xmlns:wp="http://schemas.openxmlformats.org/drawingml/2006/wordprocessingDrawing" xmlns:w10="urn:schemas-microsoft-com:office:word" xmlns:w="http://schemas.openxmlformats.org/wordprocessingml/2006/main" xmlns:w14="http://schemas.microsoft.com/office/word/2010/wordml" xmlns:w15="http://schemas.microsoft.com/office/word/2012/wordml" xmlns:w16cex="http://schemas.microsoft.com/office/word/2018/wordml/cex" xmlns:w16cid="http://schemas.microsoft.com/office/word/2016/wordml/cid" xmlns:w16="http://schemas.microsoft.com/office/word/2018/wordml" xmlns:w16sdtdh="http://schemas.microsoft.com/office/word/2020/wordml/sdtdatahash" xmlns:w16se="http://schemas.microsoft.com/office/word/2015/wordml/symex" xmlns:wpg="http://schemas.microsoft.com/office/word/2010/wordprocessingGroup" xmlns:wpi="http://schemas.microsoft.com/office/word/2010/wordprocessingInk" xmlns:wne="http://schemas.microsoft.com/office/word/2006/wordml" xmlns:wps="http://schemas.microsoft.com/office/word/2010/wordprocessingShape" mc:Ignorable="w14 w15 w16se w16cid w16 w16cex w16sdtdh wp14">
+<w:ftr xmlns:wpc="http://schemas.microsoft.com/office/word/2010/wordprocessingCanvas" xmlns:cx="http://schemas.microsoft.com/office/drawing/2014/chartex" xmlns:cx1="http://schemas.microsoft.com/office/drawing/2015/9/8/chartex" xmlns:cx2="http://schemas.microsoft.com/office/drawing/2015/10/21/chartex" xmlns:cx3="http://schemas.microsoft.com/office/drawing/2016/5/9/chartex" xmlns:cx4="http://schemas.microsoft.com/office/drawing/2016/5/10/chartex" xmlns:cx5="http://schemas.microsoft.com/office/drawing/2016/5/11/chartex" xmlns:cx6="http://schemas.microsoft.com/office/drawing/2016/5/12/chartex" xmlns:cx7="http://schemas.microsoft.com/office/drawing/2016/5/13/chartex" xmlns:cx8="http://schemas.microsoft.com/office/drawing/2016/5/14/chartex" xmlns:mc="http://schemas.openxmlformats.org/markup-compatibility/2006" xmlns:aink="http://schemas.microsoft.com/office/drawing/2016/ink" xmlns:am3d="http://schemas.microsoft.com/office/drawing/2017/model3d" xmlns:o="urn:schemas-microsoft-com:office:office" xmlns:oel="http://schemas.microsoft.com/office/2019/extlst" xmlns:r="http://schemas.openxmlformats.org/officeDocument/2006/relationships" xmlns:m="http://schemas.openxmlformats.org/officeDocument/2006/math" xmlns:v="urn:schemas-microsoft-com:vml" xmlns:wp14="http://schemas.microsoft.com/office/word/2010/wordprocessingDrawing" xmlns:wp="http://schemas.openxmlformats.org/drawingml/2006/wordprocessingDrawing" xmlns:w10="urn:schemas-microsoft-com:office:word" xmlns:w="http://schemas.openxmlformats.org/wordprocessingml/2006/main" xmlns:w14="http://schemas.microsoft.com/office/word/2010/wordml" xmlns:w15="http://schemas.microsoft.com/office/word/2012/wordml" xmlns:w16cei="http://schemas.microsoft.com/office/word/2026/wordml/cei" xmlns:w16cex="http://schemas.microsoft.com/office/word/2018/wordml/cex" xmlns:w16cid="http://schemas.microsoft.com/office/word/2016/wordml/cid" xmlns:w16="http://schemas.microsoft.com/office/word/2018/wordml" xmlns:w16du="http://schemas.microsoft.com/office/word/2023/wordml/word16du" xmlns:w16sdtdh="http://schemas.microsoft.com/office/word/2020/wordml/sdtdatahash" xmlns:w16sdtfl="http://schemas.microsoft.com/office/word/2024/wordml/sdtformatlock" xmlns:w16se="http://schemas.microsoft.com/office/word/2015/wordml/symex" xmlns:wpg="http://schemas.microsoft.com/office/word/2010/wordprocessingGroup" xmlns:wpi="http://schemas.microsoft.com/office/word/2010/wordprocessingInk" xmlns:wne="http://schemas.microsoft.com/office/word/2006/wordml" xmlns:wps="http://schemas.microsoft.com/office/word/2010/wordprocessingShape" mc:Ignorable="w14 w15 w16se w16cid w16 w16cex w16sdtdh w16sdtfl w16du wp14">
   <w:p>
     <w:pPr>
       <w:pStyle w:val="AltBilgi"/>
       <w:jc w:val="right"/>
       <w:rPr>
-        <w:color w:val="595959" w:themeColor="text1" w:themeTint="A6"/>
-        <w:sz w:val="18"/>
-        <w:szCs w:val="18"/>
+        <w:rFonts w:asciiTheme="minorHAnsi" w:hAnsiTheme="minorHAnsi" w:cstheme="minorHAnsi"/>
+        <w:sz w:val="32"/>
+        <w:szCs w:val="32"/>
       </w:rPr>
     </w:pPr>
     <w:r>
       <w:rPr>
+        <w:rFonts w:asciiTheme="minorHAnsi" w:hAnsiTheme="minorHAnsi" w:cstheme="minorHAnsi"/>
         <w:color w:val="595959" w:themeColor="text1" w:themeTint="A6"/>
-        <w:sz w:val="18"/>
-        <w:szCs w:val="18"/>
+        <w:sz w:val="22"/>
+        <w:szCs w:val="22"/>
       </w:rPr>
-      <w:t>FR265/00/20.09.2022</w:t>
+      <w:t>F</w:t>
+    </w:r>
+    <w:r>
+      <w:rPr>
+        <w:rFonts w:asciiTheme="minorHAnsi" w:hAnsiTheme="minorHAnsi" w:cstheme="minorHAnsi"/>
+        <w:color w:val="595959" w:themeColor="text1" w:themeTint="A6"/>
+        <w:sz w:val="22"/>
+        <w:szCs w:val="22"/>
+      </w:rPr>
+      <w:t>R265/00/20.09.2022</w:t>
+    </w:r>
+    <w:r>
+      <w:rPr>
+        <w:rFonts w:asciiTheme="minorHAnsi" w:hAnsiTheme="minorHAnsi" w:cstheme="minorHAnsi"/>
+        <w:color w:val="595959" w:themeColor="text1" w:themeTint="A6"/>
+        <w:sz w:val="22"/>
+        <w:szCs w:val="22"/>
+      </w:rPr>
+      <w:t>/</w:t>
+    </w:r>
+    <w:r>
+      <w:rPr>
+        <w:rFonts w:asciiTheme="minorHAnsi" w:hAnsiTheme="minorHAnsi" w:cstheme="minorHAnsi"/>
+        <w:color w:val="595959" w:themeColor="text1" w:themeTint="A6"/>
+        <w:sz w:val="22"/>
+        <w:szCs w:val="22"/>
+      </w:rPr>
+      <w:t>04/11.08.2026</w:t>
     </w:r>
   </w:p>
+</w:ftr>
+</file>
+
+<file path=word/footer3.xml><?xml version="1.0" encoding="utf-8"?>
+<w:ftr xmlns:wpc="http://schemas.microsoft.com/office/word/2010/wordprocessingCanvas" xmlns:cx="http://schemas.microsoft.com/office/drawing/2014/chartex" xmlns:cx1="http://schemas.microsoft.com/office/drawing/2015/9/8/chartex" xmlns:cx2="http://schemas.microsoft.com/office/drawing/2015/10/21/chartex" xmlns:cx3="http://schemas.microsoft.com/office/drawing/2016/5/9/chartex" xmlns:cx4="http://schemas.microsoft.com/office/drawing/2016/5/10/chartex" xmlns:cx5="http://schemas.microsoft.com/office/drawing/2016/5/11/chartex" xmlns:cx6="http://schemas.microsoft.com/office/drawing/2016/5/12/chartex" xmlns:cx7="http://schemas.microsoft.com/office/drawing/2016/5/13/chartex" xmlns:cx8="http://schemas.microsoft.com/office/drawing/2016/5/14/chartex" xmlns:mc="http://schemas.openxmlformats.org/markup-compatibility/2006" xmlns:aink="http://schemas.microsoft.com/office/drawing/2016/ink" xmlns:am3d="http://schemas.microsoft.com/office/drawing/2017/model3d" xmlns:o="urn:schemas-microsoft-com:office:office" xmlns:oel="http://schemas.microsoft.com/office/2019/extlst" xmlns:r="http://schemas.openxmlformats.org/officeDocument/2006/relationships" xmlns:m="http://schemas.openxmlformats.org/officeDocument/2006/math" xmlns:v="urn:schemas-microsoft-com:vml" xmlns:wp14="http://schemas.microsoft.com/office/word/2010/wordprocessingDrawing" xmlns:wp="http://schemas.openxmlformats.org/drawingml/2006/wordprocessingDrawing" xmlns:w10="urn:schemas-microsoft-com:office:word" xmlns:w="http://schemas.openxmlformats.org/wordprocessingml/2006/main" xmlns:w14="http://schemas.microsoft.com/office/word/2010/wordml" xmlns:w15="http://schemas.microsoft.com/office/word/2012/wordml" xmlns:w16cei="http://schemas.microsoft.com/office/word/2026/wordml/cei" xmlns:w16cex="http://schemas.microsoft.com/office/word/2018/wordml/cex" xmlns:w16cid="http://schemas.microsoft.com/office/word/2016/wordml/cid" xmlns:w16="http://schemas.microsoft.com/office/word/2018/wordml" xmlns:w16du="http://schemas.microsoft.com/office/word/2023/wordml/word16du" xmlns:w16sdtdh="http://schemas.microsoft.com/office/word/2020/wordml/sdtdatahash" xmlns:w16sdtfl="http://schemas.microsoft.com/office/word/2024/wordml/sdtformatlock" xmlns:w16se="http://schemas.microsoft.com/office/word/2015/wordml/symex" xmlns:wpg="http://schemas.microsoft.com/office/word/2010/wordprocessingGroup" xmlns:wpi="http://schemas.microsoft.com/office/word/2010/wordprocessingInk" xmlns:wne="http://schemas.microsoft.com/office/word/2006/wordml" xmlns:wps="http://schemas.microsoft.com/office/word/2010/wordprocessingShape" mc:Ignorable="w14 w15 w16se w16cid w16 w16cex w16sdtdh w16sdtfl w16du wp14">
   <w:p>
     <w:pPr>
       <w:pStyle w:val="AltBilgi"/>
-      <w:jc w:val="right"/>
     </w:pPr>
   </w:p>
 </w:ftr>
 </file>
 
 <file path=word/footnotes.xml><?xml version="1.0" encoding="utf-8"?>
-<w:footnotes xmlns:wpc="http://schemas.microsoft.com/office/word/2010/wordprocessingCanvas" xmlns:cx="http://schemas.microsoft.com/office/drawing/2014/chartex" xmlns:cx1="http://schemas.microsoft.com/office/drawing/2015/9/8/chartex" xmlns:cx2="http://schemas.microsoft.com/office/drawing/2015/10/21/chartex" xmlns:cx3="http://schemas.microsoft.com/office/drawing/2016/5/9/chartex" xmlns:cx4="http://schemas.microsoft.com/office/drawing/2016/5/10/chartex" xmlns:cx5="http://schemas.microsoft.com/office/drawing/2016/5/11/chartex" xmlns:cx6="http://schemas.microsoft.com/office/drawing/2016/5/12/chartex" xmlns:cx7="http://schemas.microsoft.com/office/drawing/2016/5/13/chartex" xmlns:cx8="http://schemas.microsoft.com/office/drawing/2016/5/14/chartex" xmlns:mc="http://schemas.openxmlformats.org/markup-compatibility/2006" xmlns:aink="http://schemas.microsoft.com/office/drawing/2016/ink" xmlns:am3d="http://schemas.microsoft.com/office/drawing/2017/model3d" xmlns:o="urn:schemas-microsoft-com:office:office" xmlns:oel="http://schemas.microsoft.com/office/2019/extlst" xmlns:r="http://schemas.openxmlformats.org/officeDocument/2006/relationships" xmlns:m="http://schemas.openxmlformats.org/officeDocument/2006/math" xmlns:v="urn:schemas-microsoft-com:vml" xmlns:wp14="http://schemas.microsoft.com/office/word/2010/wordprocessingDrawing" xmlns:wp="http://schemas.openxmlformats.org/drawingml/2006/wordprocessingDrawing" xmlns:w10="urn:schemas-microsoft-com:office:word" xmlns:w="http://schemas.openxmlformats.org/wordprocessingml/2006/main" xmlns:w14="http://schemas.microsoft.com/office/word/2010/wordml" xmlns:w15="http://schemas.microsoft.com/office/word/2012/wordml" xmlns:w16cex="http://schemas.microsoft.com/office/word/2018/wordml/cex" xmlns:w16cid="http://schemas.microsoft.com/office/word/2016/wordml/cid" xmlns:w16="http://schemas.microsoft.com/office/word/2018/wordml" xmlns:w16sdtdh="http://schemas.microsoft.com/office/word/2020/wordml/sdtdatahash" xmlns:w16se="http://schemas.microsoft.com/office/word/2015/wordml/symex" xmlns:wpg="http://schemas.microsoft.com/office/word/2010/wordprocessingGroup" xmlns:wpi="http://schemas.microsoft.com/office/word/2010/wordprocessingInk" xmlns:wne="http://schemas.microsoft.com/office/word/2006/wordml" xmlns:wps="http://schemas.microsoft.com/office/word/2010/wordprocessingShape" mc:Ignorable="w14 w15 w16se w16cid w16 w16cex w16sdtdh wp14">
+<w:footnotes xmlns:wpc="http://schemas.microsoft.com/office/word/2010/wordprocessingCanvas" xmlns:cx="http://schemas.microsoft.com/office/drawing/2014/chartex" xmlns:cx1="http://schemas.microsoft.com/office/drawing/2015/9/8/chartex" xmlns:cx2="http://schemas.microsoft.com/office/drawing/2015/10/21/chartex" xmlns:cx3="http://schemas.microsoft.com/office/drawing/2016/5/9/chartex" xmlns:cx4="http://schemas.microsoft.com/office/drawing/2016/5/10/chartex" xmlns:cx5="http://schemas.microsoft.com/office/drawing/2016/5/11/chartex" xmlns:cx6="http://schemas.microsoft.com/office/drawing/2016/5/12/chartex" xmlns:cx7="http://schemas.microsoft.com/office/drawing/2016/5/13/chartex" xmlns:cx8="http://schemas.microsoft.com/office/drawing/2016/5/14/chartex" xmlns:mc="http://schemas.openxmlformats.org/markup-compatibility/2006" xmlns:aink="http://schemas.microsoft.com/office/drawing/2016/ink" xmlns:am3d="http://schemas.microsoft.com/office/drawing/2017/model3d" xmlns:o="urn:schemas-microsoft-com:office:office" xmlns:oel="http://schemas.microsoft.com/office/2019/extlst" xmlns:r="http://schemas.openxmlformats.org/officeDocument/2006/relationships" xmlns:m="http://schemas.openxmlformats.org/officeDocument/2006/math" xmlns:v="urn:schemas-microsoft-com:vml" xmlns:wp14="http://schemas.microsoft.com/office/word/2010/wordprocessingDrawing" xmlns:wp="http://schemas.openxmlformats.org/drawingml/2006/wordprocessingDrawing" xmlns:w10="urn:schemas-microsoft-com:office:word" xmlns:w="http://schemas.openxmlformats.org/wordprocessingml/2006/main" xmlns:w14="http://schemas.microsoft.com/office/word/2010/wordml" xmlns:w15="http://schemas.microsoft.com/office/word/2012/wordml" xmlns:w16cei="http://schemas.microsoft.com/office/word/2026/wordml/cei" xmlns:w16cex="http://schemas.microsoft.com/office/word/2018/wordml/cex" xmlns:w16cid="http://schemas.microsoft.com/office/word/2016/wordml/cid" xmlns:w16="http://schemas.microsoft.com/office/word/2018/wordml" xmlns:w16du="http://schemas.microsoft.com/office/word/2023/wordml/word16du" xmlns:w16sdtdh="http://schemas.microsoft.com/office/word/2020/wordml/sdtdatahash" xmlns:w16sdtfl="http://schemas.microsoft.com/office/word/2024/wordml/sdtformatlock" xmlns:w16se="http://schemas.microsoft.com/office/word/2015/wordml/symex" xmlns:wpg="http://schemas.microsoft.com/office/word/2010/wordprocessingGroup" xmlns:wpi="http://schemas.microsoft.com/office/word/2010/wordprocessingInk" xmlns:wne="http://schemas.microsoft.com/office/word/2006/wordml" xmlns:wps="http://schemas.microsoft.com/office/word/2010/wordprocessingShape" mc:Ignorable="w14 w15 w16se w16cid w16 w16cex w16sdtdh w16sdtfl w16du wp14">
   <w:footnote w:type="separator" w:id="-1">
     <w:p>
       <w:r>
@@ -1715,7 +3505,17 @@
 </file>
 
 <file path=word/header1.xml><?xml version="1.0" encoding="utf-8"?>
-<w:hdr xmlns:wpc="http://schemas.microsoft.com/office/word/2010/wordprocessingCanvas" xmlns:cx="http://schemas.microsoft.com/office/drawing/2014/chartex" xmlns:cx1="http://schemas.microsoft.com/office/drawing/2015/9/8/chartex" xmlns:cx2="http://schemas.microsoft.com/office/drawing/2015/10/21/chartex" xmlns:cx3="http://schemas.microsoft.com/office/drawing/2016/5/9/chartex" xmlns:cx4="http://schemas.microsoft.com/office/drawing/2016/5/10/chartex" xmlns:cx5="http://schemas.microsoft.com/office/drawing/2016/5/11/chartex" xmlns:cx6="http://schemas.microsoft.com/office/drawing/2016/5/12/chartex" xmlns:cx7="http://schemas.microsoft.com/office/drawing/2016/5/13/chartex" xmlns:cx8="http://schemas.microsoft.com/office/drawing/2016/5/14/chartex" xmlns:mc="http://schemas.openxmlformats.org/markup-compatibility/2006" xmlns:aink="http://schemas.microsoft.com/office/drawing/2016/ink" xmlns:am3d="http://schemas.microsoft.com/office/drawing/2017/model3d" xmlns:o="urn:schemas-microsoft-com:office:office" xmlns:oel="http://schemas.microsoft.com/office/2019/extlst" xmlns:r="http://schemas.openxmlformats.org/officeDocument/2006/relationships" xmlns:m="http://schemas.openxmlformats.org/officeDocument/2006/math" xmlns:v="urn:schemas-microsoft-com:vml" xmlns:wp14="http://schemas.microsoft.com/office/word/2010/wordprocessingDrawing" xmlns:wp="http://schemas.openxmlformats.org/drawingml/2006/wordprocessingDrawing" xmlns:w10="urn:schemas-microsoft-com:office:word" xmlns:w="http://schemas.openxmlformats.org/wordprocessingml/2006/main" xmlns:w14="http://schemas.microsoft.com/office/word/2010/wordml" xmlns:w15="http://schemas.microsoft.com/office/word/2012/wordml" xmlns:w16cex="http://schemas.microsoft.com/office/word/2018/wordml/cex" xmlns:w16cid="http://schemas.microsoft.com/office/word/2016/wordml/cid" xmlns:w16="http://schemas.microsoft.com/office/word/2018/wordml" xmlns:w16sdtdh="http://schemas.microsoft.com/office/word/2020/wordml/sdtdatahash" xmlns:w16se="http://schemas.microsoft.com/office/word/2015/wordml/symex" xmlns:wpg="http://schemas.microsoft.com/office/word/2010/wordprocessingGroup" xmlns:wpi="http://schemas.microsoft.com/office/word/2010/wordprocessingInk" xmlns:wne="http://schemas.microsoft.com/office/word/2006/wordml" xmlns:wps="http://schemas.microsoft.com/office/word/2010/wordprocessingShape" mc:Ignorable="w14 w15 w16se w16cid w16 w16cex w16sdtdh wp14">
+<w:hdr xmlns:wpc="http://schemas.microsoft.com/office/word/2010/wordprocessingCanvas" xmlns:cx="http://schemas.microsoft.com/office/drawing/2014/chartex" xmlns:cx1="http://schemas.microsoft.com/office/drawing/2015/9/8/chartex" xmlns:cx2="http://schemas.microsoft.com/office/drawing/2015/10/21/chartex" xmlns:cx3="http://schemas.microsoft.com/office/drawing/2016/5/9/chartex" xmlns:cx4="http://schemas.microsoft.com/office/drawing/2016/5/10/chartex" xmlns:cx5="http://schemas.microsoft.com/office/drawing/2016/5/11/chartex" xmlns:cx6="http://schemas.microsoft.com/office/drawing/2016/5/12/chartex" xmlns:cx7="http://schemas.microsoft.com/office/drawing/2016/5/13/chartex" xmlns:cx8="http://schemas.microsoft.com/office/drawing/2016/5/14/chartex" xmlns:mc="http://schemas.openxmlformats.org/markup-compatibility/2006" xmlns:aink="http://schemas.microsoft.com/office/drawing/2016/ink" xmlns:am3d="http://schemas.microsoft.com/office/drawing/2017/model3d" xmlns:o="urn:schemas-microsoft-com:office:office" xmlns:oel="http://schemas.microsoft.com/office/2019/extlst" xmlns:r="http://schemas.openxmlformats.org/officeDocument/2006/relationships" xmlns:m="http://schemas.openxmlformats.org/officeDocument/2006/math" xmlns:v="urn:schemas-microsoft-com:vml" xmlns:wp14="http://schemas.microsoft.com/office/word/2010/wordprocessingDrawing" xmlns:wp="http://schemas.openxmlformats.org/drawingml/2006/wordprocessingDrawing" xmlns:w10="urn:schemas-microsoft-com:office:word" xmlns:w="http://schemas.openxmlformats.org/wordprocessingml/2006/main" xmlns:w14="http://schemas.microsoft.com/office/word/2010/wordml" xmlns:w15="http://schemas.microsoft.com/office/word/2012/wordml" xmlns:w16cei="http://schemas.microsoft.com/office/word/2026/wordml/cei" xmlns:w16cex="http://schemas.microsoft.com/office/word/2018/wordml/cex" xmlns:w16cid="http://schemas.microsoft.com/office/word/2016/wordml/cid" xmlns:w16="http://schemas.microsoft.com/office/word/2018/wordml" xmlns:w16du="http://schemas.microsoft.com/office/word/2023/wordml/word16du" xmlns:w16sdtdh="http://schemas.microsoft.com/office/word/2020/wordml/sdtdatahash" xmlns:w16sdtfl="http://schemas.microsoft.com/office/word/2024/wordml/sdtformatlock" xmlns:w16se="http://schemas.microsoft.com/office/word/2015/wordml/symex" xmlns:wpg="http://schemas.microsoft.com/office/word/2010/wordprocessingGroup" xmlns:wpi="http://schemas.microsoft.com/office/word/2010/wordprocessingInk" xmlns:wne="http://schemas.microsoft.com/office/word/2006/wordml" xmlns:wps="http://schemas.microsoft.com/office/word/2010/wordprocessingShape" mc:Ignorable="w14 w15 w16se w16cid w16 w16cex w16sdtdh w16sdtfl w16du wp14">
+  <w:p>
+    <w:pPr>
+      <w:pStyle w:val="stBilgi"/>
+    </w:pPr>
+  </w:p>
+</w:hdr>
+</file>
+
+<file path=word/header2.xml><?xml version="1.0" encoding="utf-8"?>
+<w:hdr xmlns:wpc="http://schemas.microsoft.com/office/word/2010/wordprocessingCanvas" xmlns:cx="http://schemas.microsoft.com/office/drawing/2014/chartex" xmlns:cx1="http://schemas.microsoft.com/office/drawing/2015/9/8/chartex" xmlns:cx2="http://schemas.microsoft.com/office/drawing/2015/10/21/chartex" xmlns:cx3="http://schemas.microsoft.com/office/drawing/2016/5/9/chartex" xmlns:cx4="http://schemas.microsoft.com/office/drawing/2016/5/10/chartex" xmlns:cx5="http://schemas.microsoft.com/office/drawing/2016/5/11/chartex" xmlns:cx6="http://schemas.microsoft.com/office/drawing/2016/5/12/chartex" xmlns:cx7="http://schemas.microsoft.com/office/drawing/2016/5/13/chartex" xmlns:cx8="http://schemas.microsoft.com/office/drawing/2016/5/14/chartex" xmlns:mc="http://schemas.openxmlformats.org/markup-compatibility/2006" xmlns:aink="http://schemas.microsoft.com/office/drawing/2016/ink" xmlns:am3d="http://schemas.microsoft.com/office/drawing/2017/model3d" xmlns:o="urn:schemas-microsoft-com:office:office" xmlns:oel="http://schemas.microsoft.com/office/2019/extlst" xmlns:r="http://schemas.openxmlformats.org/officeDocument/2006/relationships" xmlns:m="http://schemas.openxmlformats.org/officeDocument/2006/math" xmlns:v="urn:schemas-microsoft-com:vml" xmlns:wp14="http://schemas.microsoft.com/office/word/2010/wordprocessingDrawing" xmlns:wp="http://schemas.openxmlformats.org/drawingml/2006/wordprocessingDrawing" xmlns:w10="urn:schemas-microsoft-com:office:word" xmlns:w="http://schemas.openxmlformats.org/wordprocessingml/2006/main" xmlns:w14="http://schemas.microsoft.com/office/word/2010/wordml" xmlns:w15="http://schemas.microsoft.com/office/word/2012/wordml" xmlns:w16cei="http://schemas.microsoft.com/office/word/2026/wordml/cei" xmlns:w16cex="http://schemas.microsoft.com/office/word/2018/wordml/cex" xmlns:w16cid="http://schemas.microsoft.com/office/word/2016/wordml/cid" xmlns:w16="http://schemas.microsoft.com/office/word/2018/wordml" xmlns:w16du="http://schemas.microsoft.com/office/word/2023/wordml/word16du" xmlns:w16sdtdh="http://schemas.microsoft.com/office/word/2020/wordml/sdtdatahash" xmlns:w16sdtfl="http://schemas.microsoft.com/office/word/2024/wordml/sdtformatlock" xmlns:w16se="http://schemas.microsoft.com/office/word/2015/wordml/symex" xmlns:wpg="http://schemas.microsoft.com/office/word/2010/wordprocessingGroup" xmlns:wpi="http://schemas.microsoft.com/office/word/2010/wordprocessingInk" xmlns:wne="http://schemas.microsoft.com/office/word/2006/wordml" xmlns:wps="http://schemas.microsoft.com/office/word/2010/wordprocessingShape" mc:Ignorable="w14 w15 w16se w16cid w16 w16cex w16sdtdh w16sdtfl w16du wp14">
   <w:p>
     <w:pPr>
       <w:pStyle w:val="stBilgi"/>
@@ -1870,8 +3670,18 @@
 </w:hdr>
 </file>
 
+<file path=word/header3.xml><?xml version="1.0" encoding="utf-8"?>
+<w:hdr xmlns:wpc="http://schemas.microsoft.com/office/word/2010/wordprocessingCanvas" xmlns:cx="http://schemas.microsoft.com/office/drawing/2014/chartex" xmlns:cx1="http://schemas.microsoft.com/office/drawing/2015/9/8/chartex" xmlns:cx2="http://schemas.microsoft.com/office/drawing/2015/10/21/chartex" xmlns:cx3="http://schemas.microsoft.com/office/drawing/2016/5/9/chartex" xmlns:cx4="http://schemas.microsoft.com/office/drawing/2016/5/10/chartex" xmlns:cx5="http://schemas.microsoft.com/office/drawing/2016/5/11/chartex" xmlns:cx6="http://schemas.microsoft.com/office/drawing/2016/5/12/chartex" xmlns:cx7="http://schemas.microsoft.com/office/drawing/2016/5/13/chartex" xmlns:cx8="http://schemas.microsoft.com/office/drawing/2016/5/14/chartex" xmlns:mc="http://schemas.openxmlformats.org/markup-compatibility/2006" xmlns:aink="http://schemas.microsoft.com/office/drawing/2016/ink" xmlns:am3d="http://schemas.microsoft.com/office/drawing/2017/model3d" xmlns:o="urn:schemas-microsoft-com:office:office" xmlns:oel="http://schemas.microsoft.com/office/2019/extlst" xmlns:r="http://schemas.openxmlformats.org/officeDocument/2006/relationships" xmlns:m="http://schemas.openxmlformats.org/officeDocument/2006/math" xmlns:v="urn:schemas-microsoft-com:vml" xmlns:wp14="http://schemas.microsoft.com/office/word/2010/wordprocessingDrawing" xmlns:wp="http://schemas.openxmlformats.org/drawingml/2006/wordprocessingDrawing" xmlns:w10="urn:schemas-microsoft-com:office:word" xmlns:w="http://schemas.openxmlformats.org/wordprocessingml/2006/main" xmlns:w14="http://schemas.microsoft.com/office/word/2010/wordml" xmlns:w15="http://schemas.microsoft.com/office/word/2012/wordml" xmlns:w16cei="http://schemas.microsoft.com/office/word/2026/wordml/cei" xmlns:w16cex="http://schemas.microsoft.com/office/word/2018/wordml/cex" xmlns:w16cid="http://schemas.microsoft.com/office/word/2016/wordml/cid" xmlns:w16="http://schemas.microsoft.com/office/word/2018/wordml" xmlns:w16du="http://schemas.microsoft.com/office/word/2023/wordml/word16du" xmlns:w16sdtdh="http://schemas.microsoft.com/office/word/2020/wordml/sdtdatahash" xmlns:w16sdtfl="http://schemas.microsoft.com/office/word/2024/wordml/sdtformatlock" xmlns:w16se="http://schemas.microsoft.com/office/word/2015/wordml/symex" xmlns:wpg="http://schemas.microsoft.com/office/word/2010/wordprocessingGroup" xmlns:wpi="http://schemas.microsoft.com/office/word/2010/wordprocessingInk" xmlns:wne="http://schemas.microsoft.com/office/word/2006/wordml" xmlns:wps="http://schemas.microsoft.com/office/word/2010/wordprocessingShape" mc:Ignorable="w14 w15 w16se w16cid w16 w16cex w16sdtdh w16sdtfl w16du wp14">
+  <w:p>
+    <w:pPr>
+      <w:pStyle w:val="stBilgi"/>
+    </w:pPr>
+  </w:p>
+</w:hdr>
+</file>
+
 <file path=word/styles.xml><?xml version="1.0" encoding="utf-8"?>
-<w:styles xmlns:mc="http://schemas.openxmlformats.org/markup-compatibility/2006" xmlns:r="http://schemas.openxmlformats.org/officeDocument/2006/relationships" xmlns:w="http://schemas.openxmlformats.org/wordprocessingml/2006/main" xmlns:w14="http://schemas.microsoft.com/office/word/2010/wordml" xmlns:w15="http://schemas.microsoft.com/office/word/2012/wordml" xmlns:w16cex="http://schemas.microsoft.com/office/word/2018/wordml/cex" xmlns:w16cid="http://schemas.microsoft.com/office/word/2016/wordml/cid" xmlns:w16="http://schemas.microsoft.com/office/word/2018/wordml" xmlns:w16sdtdh="http://schemas.microsoft.com/office/word/2020/wordml/sdtdatahash" xmlns:w16se="http://schemas.microsoft.com/office/word/2015/wordml/symex" mc:Ignorable="w14 w15 w16se w16cid w16 w16cex w16sdtdh">
+<w:styles xmlns:mc="http://schemas.openxmlformats.org/markup-compatibility/2006" xmlns:r="http://schemas.openxmlformats.org/officeDocument/2006/relationships" xmlns:w="http://schemas.openxmlformats.org/wordprocessingml/2006/main" xmlns:w14="http://schemas.microsoft.com/office/word/2010/wordml" xmlns:w15="http://schemas.microsoft.com/office/word/2012/wordml" xmlns:w16cex="http://schemas.microsoft.com/office/word/2018/wordml/cex" xmlns:w16cid="http://schemas.microsoft.com/office/word/2016/wordml/cid" xmlns:w16="http://schemas.microsoft.com/office/word/2018/wordml" xmlns:w16du="http://schemas.microsoft.com/office/word/2023/wordml/word16du" xmlns:w16sdtdh="http://schemas.microsoft.com/office/word/2020/wordml/sdtdatahash" xmlns:w16sdtfl="http://schemas.microsoft.com/office/word/2024/wordml/sdtformatlock" xmlns:w16se="http://schemas.microsoft.com/office/word/2015/wordml/symex" mc:Ignorable="w14 w15 w16se w16cid w16 w16cex w16sdtdh w16sdtfl w16du">
   <w:docDefaults>
     <w:rPrDefault>
       <w:rPr>
@@ -2735,7 +4545,7 @@
 </file>
 
 <file path=customXml/itemProps1.xml><?xml version="1.0" encoding="utf-8"?>
-<ds:datastoreItem xmlns:ds="http://schemas.openxmlformats.org/officeDocument/2006/customXml" ds:itemID="{B1BD1E4B-C3CF-4646-8DB3-A5427A3B8C90}">
+<ds:datastoreItem xmlns:ds="http://schemas.openxmlformats.org/officeDocument/2006/customXml" ds:itemID="{293E6F26-E271-4C01-9F4A-619B706A47E0}">
   <ds:schemaRefs>
     <ds:schemaRef ds:uri="http://schemas.openxmlformats.org/officeDocument/2006/bibliography"/>
   </ds:schemaRefs>

</xml_diff>